<commit_message>
John: Updated Data Transparency Guidelines
</commit_message>
<xml_diff>
--- a/admin/btpsych24a_DataTransparencyGuidelines.docx
+++ b/admin/btpsych24a_DataTransparencyGuidelines.docx
@@ -383,7 +383,6 @@
       </w:r>
     </w:p>
     <w:p/>
-    <w:p/>
     <w:p>
       <w:pPr>
         <w:rPr>
@@ -399,15 +398,33 @@
           <w:sz w:val="24"/>
           <w:szCs w:val="24"/>
         </w:rPr>
-        <w:t xml:space="preserve">Table 1. </w:t>
+        <w:t xml:space="preserve">Table </w:t>
       </w:r>
       <w:r>
         <w:rPr>
           <w:rFonts w:ascii="Open Sans" w:eastAsia="Open Sans" w:hAnsi="Open Sans" w:cs="Open Sans"/>
+          <w:b/>
           <w:sz w:val="24"/>
           <w:szCs w:val="24"/>
         </w:rPr>
-        <w:t>Transparency form for third-party data.</w:t>
+        <w:t>1</w:t>
+      </w:r>
+      <w:r>
+        <w:rPr>
+          <w:rFonts w:ascii="Open Sans" w:eastAsia="Open Sans" w:hAnsi="Open Sans" w:cs="Open Sans"/>
+          <w:b/>
+          <w:sz w:val="24"/>
+          <w:szCs w:val="24"/>
+        </w:rPr>
+        <w:t xml:space="preserve">. </w:t>
+      </w:r>
+      <w:r>
+        <w:rPr>
+          <w:rFonts w:ascii="Open Sans" w:eastAsia="Open Sans" w:hAnsi="Open Sans" w:cs="Open Sans"/>
+          <w:sz w:val="24"/>
+          <w:szCs w:val="24"/>
+        </w:rPr>
+        <w:t>Transparency form for OpenAlex data.</w:t>
       </w:r>
     </w:p>
     <w:p/>
@@ -482,13 +499,7 @@
               <w:spacing w:line="240" w:lineRule="auto"/>
             </w:pPr>
             <w:r>
-              <w:t>Altmetric</w:t>
-            </w:r>
-            <w:r>
-              <w:t>.com</w:t>
-            </w:r>
-            <w:r>
-              <w:t xml:space="preserve"> data</w:t>
+              <w:t>OpenAlex data</w:t>
             </w:r>
           </w:p>
         </w:tc>
@@ -544,11 +555,19 @@
               <w:spacing w:line="240" w:lineRule="auto"/>
             </w:pPr>
             <w:r>
-              <w:t>Altmetric</w:t>
-            </w:r>
-            <w:r>
-              <w:t>.com</w:t>
-            </w:r>
+              <w:t>OpenAlex/</w:t>
+            </w:r>
+            <w:proofErr w:type="spellStart"/>
+            <w:r>
+              <w:t>OurRes</w:t>
+            </w:r>
+            <w:r>
+              <w:t>e</w:t>
+            </w:r>
+            <w:r>
+              <w:t>arch</w:t>
+            </w:r>
+            <w:proofErr w:type="spellEnd"/>
           </w:p>
         </w:tc>
       </w:tr>
@@ -665,26 +684,30 @@
               <w:spacing w:line="240" w:lineRule="auto"/>
             </w:pPr>
             <w:r>
-              <w:t xml:space="preserve">Altmetric. (2025). </w:t>
-            </w:r>
-            <w:r>
-              <w:rPr>
-                <w:i/>
-                <w:iCs/>
-              </w:rPr>
-              <w:t>Altmetric Explorer</w:t>
-            </w:r>
-            <w:r>
-              <w:t xml:space="preserve"> [Data set]. Altmetric. </w:t>
-            </w:r>
-            <w:hyperlink r:id="rId8" w:tgtFrame="_new" w:history="1">
-              <w:r>
-                <w:rPr>
-                  <w:rStyle w:val="Hyperlink"/>
-                </w:rPr>
-                <w:t>https://www.altmetric.com/</w:t>
-              </w:r>
-            </w:hyperlink>
+              <w:rPr>
+                <w:lang w:val="pt-BR"/>
+              </w:rPr>
+              <w:t xml:space="preserve">Priem, J., Piwowar, H., &amp; Orr, R. (2022). </w:t>
+            </w:r>
+            <w:r>
+              <w:t xml:space="preserve">OpenAlex: A </w:t>
+            </w:r>
+            <w:proofErr w:type="gramStart"/>
+            <w:r>
+              <w:t>fully-open</w:t>
+            </w:r>
+            <w:proofErr w:type="gramEnd"/>
+            <w:r>
+              <w:t xml:space="preserve"> index of scholarly works, authors, venues, institutions, and concepts. </w:t>
+            </w:r>
+            <w:proofErr w:type="spellStart"/>
+            <w:r>
+              <w:t>ArXiv</w:t>
+            </w:r>
+            <w:proofErr w:type="spellEnd"/>
+            <w:r>
+              <w:t>. https://arxiv.org/abs/2205.01833</w:t>
+            </w:r>
           </w:p>
         </w:tc>
       </w:tr>
@@ -834,7 +857,7 @@
               <w:spacing w:line="240" w:lineRule="auto"/>
             </w:pPr>
             <w:r>
-              <w:t>Restricted</w:t>
+              <w:t>public</w:t>
             </w:r>
           </w:p>
         </w:tc>
@@ -910,92 +933,23 @@
               <w:spacing w:line="240" w:lineRule="auto"/>
             </w:pPr>
             <w:r>
-              <w:t xml:space="preserve">Altmetric.com does not allow the </w:t>
-            </w:r>
-            <w:r>
-              <w:t>publishing, display or redistribution</w:t>
-            </w:r>
-            <w:r>
-              <w:t xml:space="preserve"> of their data. </w:t>
-            </w:r>
-            <w:r>
-              <w:t> </w:t>
-            </w:r>
-            <w:r>
-              <w:t>More information can be found in the company’s guidelines and terms of use:</w:t>
-            </w:r>
-            <w:r>
               <w:br/>
             </w:r>
             <w:r>
-              <w:br/>
-            </w:r>
-            <w:r>
-              <w:t>https://www.altmetric.com/our-audience/researchers/research-access/request-researcher-access/</w:t>
-            </w:r>
-            <w:r>
-              <w:br/>
-            </w:r>
-            <w:r>
-              <w:br/>
-            </w:r>
-            <w:r>
-              <w:t>https://www.altmetric.com/terms-of-use/</w:t>
-            </w:r>
-          </w:p>
-        </w:tc>
-      </w:tr>
-      <w:tr>
-        <w:tc>
-          <w:tcPr>
-            <w:tcW w:w="4514" w:type="dxa"/>
-            <w:tcMar>
-              <w:top w:w="100" w:type="dxa"/>
-              <w:left w:w="100" w:type="dxa"/>
-              <w:bottom w:w="100" w:type="dxa"/>
-              <w:right w:w="100" w:type="dxa"/>
-            </w:tcMar>
-          </w:tcPr>
-          <w:p>
-            <w:pPr>
-              <w:rPr>
-                <w:rFonts w:ascii="Open Sans" w:eastAsia="Open Sans" w:hAnsi="Open Sans" w:cs="Open Sans"/>
-                <w:b/>
-                <w:sz w:val="24"/>
-                <w:szCs w:val="24"/>
-              </w:rPr>
-            </w:pPr>
-            <w:r>
-              <w:rPr>
-                <w:rFonts w:ascii="Open Sans" w:eastAsia="Open Sans" w:hAnsi="Open Sans" w:cs="Open Sans"/>
-                <w:b/>
-                <w:sz w:val="24"/>
-                <w:szCs w:val="24"/>
-              </w:rPr>
-              <w:t xml:space="preserve">Provide clear step-by-step instructions explaining how the </w:t>
-            </w:r>
-            <w:r>
-              <w:rPr>
-                <w:rFonts w:ascii="Open Sans" w:eastAsia="Open Sans" w:hAnsi="Open Sans" w:cs="Open Sans"/>
-                <w:b/>
-                <w:sz w:val="24"/>
-                <w:szCs w:val="24"/>
-              </w:rPr>
-              <w:lastRenderedPageBreak/>
-              <w:t>data were obtained / how an independent researcher could access the data. Ensure that you provide sufficient detail about accessing the *specific data used in the present study*.</w:t>
-            </w:r>
-          </w:p>
-        </w:tc>
-        <w:tc>
-          <w:tcPr>
-            <w:tcW w:w="4514" w:type="dxa"/>
-            <w:tcMar>
-              <w:top w:w="100" w:type="dxa"/>
-              <w:left w:w="100" w:type="dxa"/>
-              <w:bottom w:w="100" w:type="dxa"/>
-              <w:right w:w="100" w:type="dxa"/>
-            </w:tcMar>
-          </w:tcPr>
+              <w:t xml:space="preserve">OpenAlex data is licensed as </w:t>
+            </w:r>
+            <w:hyperlink r:id="rId8" w:history="1">
+              <w:r>
+                <w:rPr>
+                  <w:rStyle w:val="Hyperlink"/>
+                </w:rPr>
+                <w:t>CC0</w:t>
+              </w:r>
+            </w:hyperlink>
+            <w:r>
+              <w:t xml:space="preserve"> so it is free to use and distribute.</w:t>
+            </w:r>
+          </w:p>
           <w:p>
             <w:pPr>
               <w:widowControl w:val="0"/>
@@ -1008,111 +962,6 @@
               </w:pBdr>
               <w:spacing w:line="240" w:lineRule="auto"/>
             </w:pPr>
-            <w:r>
-              <w:lastRenderedPageBreak/>
-              <w:t xml:space="preserve">Data </w:t>
-            </w:r>
-            <w:r>
-              <w:t>were</w:t>
-            </w:r>
-            <w:r>
-              <w:t xml:space="preserve"> manually extracted from the Altmetric.com website</w:t>
-            </w:r>
-            <w:r>
-              <w:t xml:space="preserve"> between 09/23/2024 to 10/01/2024</w:t>
-            </w:r>
-            <w:r>
-              <w:t xml:space="preserve">. </w:t>
-            </w:r>
-            <w:r>
-              <w:t>We extracted a</w:t>
-            </w:r>
-            <w:r>
-              <w:t xml:space="preserve"> list of </w:t>
-            </w:r>
-            <w:r>
-              <w:t xml:space="preserve">all </w:t>
-            </w:r>
-            <w:r>
-              <w:t xml:space="preserve">psychology paper </w:t>
-            </w:r>
-            <w:proofErr w:type="gramStart"/>
-            <w:r>
-              <w:t>DOI’s</w:t>
-            </w:r>
-            <w:proofErr w:type="gramEnd"/>
-            <w:r>
-              <w:t xml:space="preserve"> from</w:t>
-            </w:r>
-            <w:r>
-              <w:t xml:space="preserve"> the</w:t>
-            </w:r>
-            <w:r>
-              <w:t xml:space="preserve"> </w:t>
-            </w:r>
-            <w:proofErr w:type="spellStart"/>
-            <w:r>
-              <w:t>Openalex</w:t>
-            </w:r>
-            <w:proofErr w:type="spellEnd"/>
-            <w:r>
-              <w:t xml:space="preserve"> </w:t>
-            </w:r>
-            <w:r>
-              <w:lastRenderedPageBreak/>
-              <w:t>database</w:t>
-            </w:r>
-            <w:r>
-              <w:t xml:space="preserve">, </w:t>
-            </w:r>
-            <w:r>
-              <w:t>split the list in</w:t>
-            </w:r>
-            <w:r>
-              <w:t xml:space="preserve"> </w:t>
-            </w:r>
-            <w:r>
-              <w:t>batches of 20,000 DOI’s</w:t>
-            </w:r>
-            <w:r>
-              <w:t xml:space="preserve"> (</w:t>
-            </w:r>
-            <w:proofErr w:type="spellStart"/>
-            <w:r>
-              <w:t>Altmetric’s</w:t>
-            </w:r>
-            <w:proofErr w:type="spellEnd"/>
-            <w:r>
-              <w:t xml:space="preserve"> search limit is 25,000) and entered the batches of </w:t>
-            </w:r>
-            <w:proofErr w:type="gramStart"/>
-            <w:r>
-              <w:t>DOI’s</w:t>
-            </w:r>
-            <w:proofErr w:type="gramEnd"/>
-            <w:r>
-              <w:t xml:space="preserve"> into the </w:t>
-            </w:r>
-            <w:proofErr w:type="spellStart"/>
-            <w:r>
-              <w:t>Altmetrics</w:t>
-            </w:r>
-            <w:proofErr w:type="spellEnd"/>
-            <w:r>
-              <w:t xml:space="preserve"> advanced search bar. Then, </w:t>
-            </w:r>
-            <w:r>
-              <w:t xml:space="preserve">we exported the </w:t>
-            </w:r>
-            <w:r>
-              <w:t>search results as .csv files</w:t>
-            </w:r>
-            <w:r>
-              <w:t xml:space="preserve"> and</w:t>
-            </w:r>
-            <w:r>
-              <w:t xml:space="preserve"> combined into a single spreadsheet.</w:t>
-            </w:r>
           </w:p>
           <w:p>
             <w:pPr>
@@ -1126,7 +975,63 @@
               </w:pBdr>
               <w:spacing w:line="240" w:lineRule="auto"/>
             </w:pPr>
-          </w:p>
+            <w:r>
+              <w:t>https://docs.openalex.org/additional-help/faq</w:t>
+            </w:r>
+          </w:p>
+        </w:tc>
+      </w:tr>
+      <w:tr>
+        <w:tc>
+          <w:tcPr>
+            <w:tcW w:w="4514" w:type="dxa"/>
+            <w:tcMar>
+              <w:top w:w="100" w:type="dxa"/>
+              <w:left w:w="100" w:type="dxa"/>
+              <w:bottom w:w="100" w:type="dxa"/>
+              <w:right w:w="100" w:type="dxa"/>
+            </w:tcMar>
+          </w:tcPr>
+          <w:p>
+            <w:pPr>
+              <w:rPr>
+                <w:rFonts w:ascii="Open Sans" w:eastAsia="Open Sans" w:hAnsi="Open Sans" w:cs="Open Sans"/>
+                <w:b/>
+                <w:sz w:val="24"/>
+                <w:szCs w:val="24"/>
+              </w:rPr>
+            </w:pPr>
+            <w:r>
+              <w:rPr>
+                <w:rFonts w:ascii="Open Sans" w:eastAsia="Open Sans" w:hAnsi="Open Sans" w:cs="Open Sans"/>
+                <w:b/>
+                <w:sz w:val="24"/>
+                <w:szCs w:val="24"/>
+              </w:rPr>
+              <w:t xml:space="preserve">Provide clear step-by-step instructions explaining how the data were obtained / how an </w:t>
+            </w:r>
+            <w:r>
+              <w:rPr>
+                <w:rFonts w:ascii="Open Sans" w:eastAsia="Open Sans" w:hAnsi="Open Sans" w:cs="Open Sans"/>
+                <w:b/>
+                <w:sz w:val="24"/>
+                <w:szCs w:val="24"/>
+              </w:rPr>
+              <w:lastRenderedPageBreak/>
+              <w:t>independent researcher could access the data. Ensure that you provide sufficient detail about accessing the *specific data used in the present study*.</w:t>
+            </w:r>
+          </w:p>
+        </w:tc>
+        <w:tc>
+          <w:tcPr>
+            <w:tcW w:w="4514" w:type="dxa"/>
+            <w:tcMar>
+              <w:top w:w="100" w:type="dxa"/>
+              <w:left w:w="100" w:type="dxa"/>
+              <w:bottom w:w="100" w:type="dxa"/>
+              <w:right w:w="100" w:type="dxa"/>
+            </w:tcMar>
+          </w:tcPr>
           <w:p>
             <w:pPr>
               <w:widowControl w:val="0"/>
@@ -1140,7 +1045,36 @@
               <w:spacing w:line="240" w:lineRule="auto"/>
             </w:pPr>
             <w:r>
-              <w:t>An independent researcher could access the data by requesting a password to the encrypted file stored on the OSF, which can only be shared for peer-review purposes.</w:t>
+              <w:lastRenderedPageBreak/>
+              <w:t xml:space="preserve">Data were extracted using the </w:t>
+            </w:r>
+            <w:proofErr w:type="spellStart"/>
+            <w:r>
+              <w:t>oa_</w:t>
+            </w:r>
+            <w:proofErr w:type="gramStart"/>
+            <w:r>
+              <w:t>fetch</w:t>
+            </w:r>
+            <w:proofErr w:type="spellEnd"/>
+            <w:r>
+              <w:t>(</w:t>
+            </w:r>
+            <w:proofErr w:type="gramEnd"/>
+            <w:r>
+              <w:t xml:space="preserve">) function from the R package </w:t>
+            </w:r>
+            <w:proofErr w:type="spellStart"/>
+            <w:r>
+              <w:t>openalexR</w:t>
+            </w:r>
+            <w:proofErr w:type="spellEnd"/>
+            <w:r>
+              <w:t xml:space="preserve">. We filtered the data using the parameters entity = “works” and primary_topic.field.id = </w:t>
+            </w:r>
+            <w:r>
+              <w:lastRenderedPageBreak/>
+              <w:t>“32”, which corresponds to the Psychology field. We downloaded entries from the year 2000 onwards, one publication year at a time, due to resource constraints. Last, we combined the data sets of each publication year into a single data frame.</w:t>
             </w:r>
           </w:p>
         </w:tc>
@@ -1289,53 +1223,10 @@
                 <w:rPr>
                   <w:rStyle w:val="Hyperlink"/>
                 </w:rPr>
-                <w:t>https://details-page-api-docs.altmetric.com/data-endpoints-counts.html</w:t>
+                <w:t>https://docs.openalex.org/api-entities/works/work-object</w:t>
               </w:r>
             </w:hyperlink>
           </w:p>
-        </w:tc>
-      </w:tr>
-      <w:tr>
-        <w:tc>
-          <w:tcPr>
-            <w:tcW w:w="4514" w:type="dxa"/>
-            <w:tcMar>
-              <w:top w:w="100" w:type="dxa"/>
-              <w:left w:w="100" w:type="dxa"/>
-              <w:bottom w:w="100" w:type="dxa"/>
-              <w:right w:w="100" w:type="dxa"/>
-            </w:tcMar>
-          </w:tcPr>
-          <w:p>
-            <w:pPr>
-              <w:rPr>
-                <w:rFonts w:ascii="Open Sans" w:eastAsia="Open Sans" w:hAnsi="Open Sans" w:cs="Open Sans"/>
-                <w:b/>
-                <w:sz w:val="24"/>
-                <w:szCs w:val="24"/>
-              </w:rPr>
-            </w:pPr>
-            <w:r>
-              <w:rPr>
-                <w:rFonts w:ascii="Open Sans" w:eastAsia="Open Sans" w:hAnsi="Open Sans" w:cs="Open Sans"/>
-                <w:b/>
-                <w:sz w:val="24"/>
-                <w:szCs w:val="24"/>
-              </w:rPr>
-              <w:t>If there are materials relevant to acquisition of this data (e.g., survey instruments) please link to them. Please also link to documentation that describes the materials.</w:t>
-            </w:r>
-          </w:p>
-        </w:tc>
-        <w:tc>
-          <w:tcPr>
-            <w:tcW w:w="4514" w:type="dxa"/>
-            <w:tcMar>
-              <w:top w:w="100" w:type="dxa"/>
-              <w:left w:w="100" w:type="dxa"/>
-              <w:bottom w:w="100" w:type="dxa"/>
-              <w:right w:w="100" w:type="dxa"/>
-            </w:tcMar>
-          </w:tcPr>
           <w:p>
             <w:pPr>
               <w:widowControl w:val="0"/>
@@ -1348,9 +1239,6 @@
               </w:pBdr>
               <w:spacing w:line="240" w:lineRule="auto"/>
             </w:pPr>
-            <w:r>
-              <w:t>N/A</w:t>
-            </w:r>
           </w:p>
         </w:tc>
       </w:tr>
@@ -1381,7 +1269,7 @@
                 <w:sz w:val="24"/>
                 <w:szCs w:val="24"/>
               </w:rPr>
-              <w:t>Other information about these data.</w:t>
+              <w:t>If there are materials relevant to acquisition of this data (e.g., survey instruments) please link to them. Please also link to documentation that describes the materials.</w:t>
             </w:r>
           </w:p>
         </w:tc>
@@ -1413,6 +1301,2221 @@
           </w:p>
         </w:tc>
       </w:tr>
+      <w:tr>
+        <w:tc>
+          <w:tcPr>
+            <w:tcW w:w="4514" w:type="dxa"/>
+            <w:tcMar>
+              <w:top w:w="100" w:type="dxa"/>
+              <w:left w:w="100" w:type="dxa"/>
+              <w:bottom w:w="100" w:type="dxa"/>
+              <w:right w:w="100" w:type="dxa"/>
+            </w:tcMar>
+          </w:tcPr>
+          <w:p>
+            <w:pPr>
+              <w:rPr>
+                <w:rFonts w:ascii="Open Sans" w:eastAsia="Open Sans" w:hAnsi="Open Sans" w:cs="Open Sans"/>
+                <w:b/>
+                <w:sz w:val="24"/>
+                <w:szCs w:val="24"/>
+              </w:rPr>
+            </w:pPr>
+            <w:r>
+              <w:rPr>
+                <w:rFonts w:ascii="Open Sans" w:eastAsia="Open Sans" w:hAnsi="Open Sans" w:cs="Open Sans"/>
+                <w:b/>
+                <w:sz w:val="24"/>
+                <w:szCs w:val="24"/>
+              </w:rPr>
+              <w:t>Other information about these data.</w:t>
+            </w:r>
+          </w:p>
+        </w:tc>
+        <w:tc>
+          <w:tcPr>
+            <w:tcW w:w="4514" w:type="dxa"/>
+            <w:tcMar>
+              <w:top w:w="100" w:type="dxa"/>
+              <w:left w:w="100" w:type="dxa"/>
+              <w:bottom w:w="100" w:type="dxa"/>
+              <w:right w:w="100" w:type="dxa"/>
+            </w:tcMar>
+          </w:tcPr>
+          <w:p>
+            <w:pPr>
+              <w:widowControl w:val="0"/>
+              <w:pBdr>
+                <w:top w:val="nil"/>
+                <w:left w:val="nil"/>
+                <w:bottom w:val="nil"/>
+                <w:right w:val="nil"/>
+                <w:between w:val="nil"/>
+              </w:pBdr>
+              <w:spacing w:line="240" w:lineRule="auto"/>
+            </w:pPr>
+            <w:r>
+              <w:t>N/A</w:t>
+            </w:r>
+          </w:p>
+        </w:tc>
+      </w:tr>
+    </w:tbl>
+    <w:p/>
+    <w:p>
+      <w:pPr>
+        <w:rPr>
+          <w:rFonts w:ascii="Open Sans" w:eastAsia="Open Sans" w:hAnsi="Open Sans" w:cs="Open Sans"/>
+        </w:rPr>
+      </w:pPr>
+      <w:r>
+        <w:rPr>
+          <w:rFonts w:ascii="Open Sans" w:eastAsia="Open Sans" w:hAnsi="Open Sans" w:cs="Open Sans"/>
+        </w:rPr>
+        <w:t>*Ideally link to publicly available documentation. Private documentation can be shared with the journal’s STAR Team (</w:t>
+      </w:r>
+      <w:r>
+        <w:rPr>
+          <w:rFonts w:ascii="Open Sans" w:eastAsia="Open Sans" w:hAnsi="Open Sans" w:cs="Open Sans"/>
+          <w:color w:val="1F1F1F"/>
+        </w:rPr>
+        <w:t>psych.star.team@gmail.com).</w:t>
+      </w:r>
+    </w:p>
+    <w:p/>
+    <w:p/>
+    <w:p>
+      <w:pPr>
+        <w:rPr>
+          <w:rFonts w:ascii="Open Sans" w:eastAsia="Open Sans" w:hAnsi="Open Sans" w:cs="Open Sans"/>
+          <w:sz w:val="24"/>
+          <w:szCs w:val="24"/>
+        </w:rPr>
+      </w:pPr>
+      <w:r>
+        <w:rPr>
+          <w:rFonts w:ascii="Open Sans" w:eastAsia="Open Sans" w:hAnsi="Open Sans" w:cs="Open Sans"/>
+          <w:b/>
+          <w:sz w:val="24"/>
+          <w:szCs w:val="24"/>
+        </w:rPr>
+        <w:t xml:space="preserve">Table </w:t>
+      </w:r>
+      <w:r>
+        <w:rPr>
+          <w:rFonts w:ascii="Open Sans" w:eastAsia="Open Sans" w:hAnsi="Open Sans" w:cs="Open Sans"/>
+          <w:b/>
+          <w:sz w:val="24"/>
+          <w:szCs w:val="24"/>
+        </w:rPr>
+        <w:t>2</w:t>
+      </w:r>
+      <w:r>
+        <w:rPr>
+          <w:rFonts w:ascii="Open Sans" w:eastAsia="Open Sans" w:hAnsi="Open Sans" w:cs="Open Sans"/>
+          <w:b/>
+          <w:sz w:val="24"/>
+          <w:szCs w:val="24"/>
+        </w:rPr>
+        <w:t xml:space="preserve">. </w:t>
+      </w:r>
+      <w:r>
+        <w:rPr>
+          <w:rFonts w:ascii="Open Sans" w:eastAsia="Open Sans" w:hAnsi="Open Sans" w:cs="Open Sans"/>
+          <w:sz w:val="24"/>
+          <w:szCs w:val="24"/>
+        </w:rPr>
+        <w:t xml:space="preserve">Transparency form for </w:t>
+      </w:r>
+      <w:r>
+        <w:rPr>
+          <w:rFonts w:ascii="Open Sans" w:eastAsia="Open Sans" w:hAnsi="Open Sans" w:cs="Open Sans"/>
+          <w:sz w:val="24"/>
+          <w:szCs w:val="24"/>
+        </w:rPr>
+        <w:t>Altmetric.com</w:t>
+      </w:r>
+      <w:r>
+        <w:rPr>
+          <w:rFonts w:ascii="Open Sans" w:eastAsia="Open Sans" w:hAnsi="Open Sans" w:cs="Open Sans"/>
+          <w:sz w:val="24"/>
+          <w:szCs w:val="24"/>
+        </w:rPr>
+        <w:t xml:space="preserve"> data.</w:t>
+      </w:r>
+    </w:p>
+    <w:p/>
+    <w:tbl>
+      <w:tblPr>
+        <w:tblStyle w:val="a0"/>
+        <w:tblW w:w="9029" w:type="dxa"/>
+        <w:tblInd w:w="0" w:type="dxa"/>
+        <w:tblBorders>
+          <w:top w:val="single" w:sz="8" w:space="0" w:color="000000"/>
+          <w:left w:val="single" w:sz="8" w:space="0" w:color="000000"/>
+          <w:bottom w:val="single" w:sz="8" w:space="0" w:color="000000"/>
+          <w:right w:val="single" w:sz="8" w:space="0" w:color="000000"/>
+          <w:insideH w:val="single" w:sz="8" w:space="0" w:color="000000"/>
+          <w:insideV w:val="single" w:sz="8" w:space="0" w:color="000000"/>
+        </w:tblBorders>
+        <w:tblLayout w:type="fixed"/>
+        <w:tblLook w:val="0600" w:firstRow="0" w:lastRow="0" w:firstColumn="0" w:lastColumn="0" w:noHBand="1" w:noVBand="1"/>
+      </w:tblPr>
+      <w:tblGrid>
+        <w:gridCol w:w="4514"/>
+        <w:gridCol w:w="4515"/>
+      </w:tblGrid>
+      <w:tr>
+        <w:tc>
+          <w:tcPr>
+            <w:tcW w:w="4514" w:type="dxa"/>
+            <w:tcMar>
+              <w:top w:w="100" w:type="dxa"/>
+              <w:left w:w="100" w:type="dxa"/>
+              <w:bottom w:w="100" w:type="dxa"/>
+              <w:right w:w="100" w:type="dxa"/>
+            </w:tcMar>
+          </w:tcPr>
+          <w:p>
+            <w:pPr>
+              <w:rPr>
+                <w:b/>
+              </w:rPr>
+            </w:pPr>
+            <w:r>
+              <w:rPr>
+                <w:rFonts w:ascii="Open Sans" w:eastAsia="Open Sans" w:hAnsi="Open Sans" w:cs="Open Sans"/>
+                <w:b/>
+                <w:sz w:val="24"/>
+                <w:szCs w:val="24"/>
+              </w:rPr>
+              <w:t>Name and/or source of data</w:t>
+            </w:r>
+          </w:p>
+        </w:tc>
+        <w:tc>
+          <w:tcPr>
+            <w:tcW w:w="4514" w:type="dxa"/>
+            <w:tcMar>
+              <w:top w:w="100" w:type="dxa"/>
+              <w:left w:w="100" w:type="dxa"/>
+              <w:bottom w:w="100" w:type="dxa"/>
+              <w:right w:w="100" w:type="dxa"/>
+            </w:tcMar>
+          </w:tcPr>
+          <w:p>
+            <w:pPr>
+              <w:widowControl w:val="0"/>
+              <w:pBdr>
+                <w:top w:val="nil"/>
+                <w:left w:val="nil"/>
+                <w:bottom w:val="nil"/>
+                <w:right w:val="nil"/>
+                <w:between w:val="nil"/>
+              </w:pBdr>
+              <w:spacing w:line="240" w:lineRule="auto"/>
+            </w:pPr>
+            <w:r>
+              <w:t>Altmetric</w:t>
+            </w:r>
+            <w:r>
+              <w:t>.com</w:t>
+            </w:r>
+            <w:r>
+              <w:t xml:space="preserve"> data</w:t>
+            </w:r>
+          </w:p>
+        </w:tc>
+      </w:tr>
+      <w:tr>
+        <w:tc>
+          <w:tcPr>
+            <w:tcW w:w="4514" w:type="dxa"/>
+            <w:tcMar>
+              <w:top w:w="100" w:type="dxa"/>
+              <w:left w:w="100" w:type="dxa"/>
+              <w:bottom w:w="100" w:type="dxa"/>
+              <w:right w:w="100" w:type="dxa"/>
+            </w:tcMar>
+          </w:tcPr>
+          <w:p>
+            <w:pPr>
+              <w:rPr>
+                <w:b/>
+              </w:rPr>
+            </w:pPr>
+            <w:r>
+              <w:rPr>
+                <w:rFonts w:ascii="Open Sans" w:eastAsia="Open Sans" w:hAnsi="Open Sans" w:cs="Open Sans"/>
+                <w:b/>
+                <w:sz w:val="24"/>
+                <w:szCs w:val="24"/>
+              </w:rPr>
+              <w:t>Name of individual(s) / organisation that controls the data</w:t>
+            </w:r>
+          </w:p>
+        </w:tc>
+        <w:tc>
+          <w:tcPr>
+            <w:tcW w:w="4514" w:type="dxa"/>
+            <w:tcMar>
+              <w:top w:w="100" w:type="dxa"/>
+              <w:left w:w="100" w:type="dxa"/>
+              <w:bottom w:w="100" w:type="dxa"/>
+              <w:right w:w="100" w:type="dxa"/>
+            </w:tcMar>
+          </w:tcPr>
+          <w:p>
+            <w:pPr>
+              <w:widowControl w:val="0"/>
+              <w:pBdr>
+                <w:top w:val="nil"/>
+                <w:left w:val="nil"/>
+                <w:bottom w:val="nil"/>
+                <w:right w:val="nil"/>
+                <w:between w:val="nil"/>
+              </w:pBdr>
+              <w:spacing w:line="240" w:lineRule="auto"/>
+            </w:pPr>
+            <w:r>
+              <w:t>Altmetric</w:t>
+            </w:r>
+            <w:r>
+              <w:t>.com</w:t>
+            </w:r>
+          </w:p>
+        </w:tc>
+      </w:tr>
+      <w:tr>
+        <w:tc>
+          <w:tcPr>
+            <w:tcW w:w="4514" w:type="dxa"/>
+            <w:tcMar>
+              <w:top w:w="100" w:type="dxa"/>
+              <w:left w:w="100" w:type="dxa"/>
+              <w:bottom w:w="100" w:type="dxa"/>
+              <w:right w:w="100" w:type="dxa"/>
+            </w:tcMar>
+          </w:tcPr>
+          <w:p>
+            <w:pPr>
+              <w:rPr>
+                <w:rFonts w:ascii="Open Sans" w:eastAsia="Open Sans" w:hAnsi="Open Sans" w:cs="Open Sans"/>
+                <w:b/>
+                <w:sz w:val="24"/>
+                <w:szCs w:val="24"/>
+              </w:rPr>
+            </w:pPr>
+            <w:r>
+              <w:rPr>
+                <w:rFonts w:ascii="Open Sans" w:eastAsia="Open Sans" w:hAnsi="Open Sans" w:cs="Open Sans"/>
+                <w:b/>
+                <w:sz w:val="24"/>
+                <w:szCs w:val="24"/>
+              </w:rPr>
+              <w:t>Name of author(s) who obtained the data from the third party</w:t>
+            </w:r>
+          </w:p>
+        </w:tc>
+        <w:tc>
+          <w:tcPr>
+            <w:tcW w:w="4514" w:type="dxa"/>
+            <w:tcMar>
+              <w:top w:w="100" w:type="dxa"/>
+              <w:left w:w="100" w:type="dxa"/>
+              <w:bottom w:w="100" w:type="dxa"/>
+              <w:right w:w="100" w:type="dxa"/>
+            </w:tcMar>
+          </w:tcPr>
+          <w:p>
+            <w:pPr>
+              <w:widowControl w:val="0"/>
+              <w:pBdr>
+                <w:top w:val="nil"/>
+                <w:left w:val="nil"/>
+                <w:bottom w:val="nil"/>
+                <w:right w:val="nil"/>
+                <w:between w:val="nil"/>
+              </w:pBdr>
+              <w:spacing w:line="240" w:lineRule="auto"/>
+            </w:pPr>
+            <w:r>
+              <w:t>Nicholas A. Coles</w:t>
+            </w:r>
+            <w:r>
+              <w:t xml:space="preserve"> and Joao Takayanagi</w:t>
+            </w:r>
+          </w:p>
+        </w:tc>
+      </w:tr>
+      <w:tr>
+        <w:tc>
+          <w:tcPr>
+            <w:tcW w:w="4514" w:type="dxa"/>
+            <w:tcMar>
+              <w:top w:w="100" w:type="dxa"/>
+              <w:left w:w="100" w:type="dxa"/>
+              <w:bottom w:w="100" w:type="dxa"/>
+              <w:right w:w="100" w:type="dxa"/>
+            </w:tcMar>
+          </w:tcPr>
+          <w:p>
+            <w:pPr>
+              <w:rPr>
+                <w:rFonts w:ascii="Open Sans" w:eastAsia="Open Sans" w:hAnsi="Open Sans" w:cs="Open Sans"/>
+                <w:b/>
+                <w:sz w:val="24"/>
+                <w:szCs w:val="24"/>
+              </w:rPr>
+            </w:pPr>
+            <w:r>
+              <w:rPr>
+                <w:rFonts w:ascii="Open Sans" w:eastAsia="Open Sans" w:hAnsi="Open Sans" w:cs="Open Sans"/>
+                <w:b/>
+                <w:sz w:val="24"/>
+                <w:szCs w:val="24"/>
+              </w:rPr>
+              <w:t>If relevant, provide a citation to the data here and in the manuscript.</w:t>
+            </w:r>
+          </w:p>
+        </w:tc>
+        <w:tc>
+          <w:tcPr>
+            <w:tcW w:w="4514" w:type="dxa"/>
+            <w:tcMar>
+              <w:top w:w="100" w:type="dxa"/>
+              <w:left w:w="100" w:type="dxa"/>
+              <w:bottom w:w="100" w:type="dxa"/>
+              <w:right w:w="100" w:type="dxa"/>
+            </w:tcMar>
+          </w:tcPr>
+          <w:p>
+            <w:pPr>
+              <w:widowControl w:val="0"/>
+              <w:pBdr>
+                <w:top w:val="nil"/>
+                <w:left w:val="nil"/>
+                <w:bottom w:val="nil"/>
+                <w:right w:val="nil"/>
+                <w:between w:val="nil"/>
+              </w:pBdr>
+              <w:spacing w:line="240" w:lineRule="auto"/>
+            </w:pPr>
+            <w:r>
+              <w:t xml:space="preserve">Altmetric. (2025). </w:t>
+            </w:r>
+            <w:r>
+              <w:rPr>
+                <w:i/>
+                <w:iCs/>
+              </w:rPr>
+              <w:t>Altmetric Explorer</w:t>
+            </w:r>
+            <w:r>
+              <w:t xml:space="preserve"> [Data set]. Altmetric. </w:t>
+            </w:r>
+            <w:hyperlink r:id="rId11" w:tgtFrame="_new" w:history="1">
+              <w:r>
+                <w:rPr>
+                  <w:rStyle w:val="Hyperlink"/>
+                </w:rPr>
+                <w:t>https://www.altmetric.com/</w:t>
+              </w:r>
+            </w:hyperlink>
+          </w:p>
+        </w:tc>
+      </w:tr>
+      <w:tr>
+        <w:tc>
+          <w:tcPr>
+            <w:tcW w:w="4514" w:type="dxa"/>
+            <w:tcMar>
+              <w:top w:w="100" w:type="dxa"/>
+              <w:left w:w="100" w:type="dxa"/>
+              <w:bottom w:w="100" w:type="dxa"/>
+              <w:right w:w="100" w:type="dxa"/>
+            </w:tcMar>
+          </w:tcPr>
+          <w:p>
+            <w:pPr>
+              <w:rPr>
+                <w:rFonts w:ascii="Open Sans" w:eastAsia="Open Sans" w:hAnsi="Open Sans" w:cs="Open Sans"/>
+                <w:b/>
+                <w:sz w:val="24"/>
+                <w:szCs w:val="24"/>
+              </w:rPr>
+            </w:pPr>
+            <w:r>
+              <w:rPr>
+                <w:rFonts w:ascii="Open Sans" w:eastAsia="Open Sans" w:hAnsi="Open Sans" w:cs="Open Sans"/>
+                <w:b/>
+                <w:sz w:val="24"/>
+                <w:szCs w:val="24"/>
+              </w:rPr>
+              <w:t>Is access to the data…</w:t>
+            </w:r>
+          </w:p>
+          <w:p>
+            <w:pPr>
+              <w:numPr>
+                <w:ilvl w:val="0"/>
+                <w:numId w:val="2"/>
+              </w:numPr>
+              <w:rPr>
+                <w:rFonts w:ascii="Open Sans" w:eastAsia="Open Sans" w:hAnsi="Open Sans" w:cs="Open Sans"/>
+                <w:b/>
+                <w:sz w:val="24"/>
+                <w:szCs w:val="24"/>
+              </w:rPr>
+            </w:pPr>
+            <w:r>
+              <w:rPr>
+                <w:rFonts w:ascii="Open Sans" w:eastAsia="Open Sans" w:hAnsi="Open Sans" w:cs="Open Sans"/>
+                <w:b/>
+                <w:sz w:val="24"/>
+                <w:szCs w:val="24"/>
+              </w:rPr>
+              <w:lastRenderedPageBreak/>
+              <w:t>public</w:t>
+            </w:r>
+          </w:p>
+          <w:p>
+            <w:pPr>
+              <w:numPr>
+                <w:ilvl w:val="0"/>
+                <w:numId w:val="2"/>
+              </w:numPr>
+              <w:rPr>
+                <w:rFonts w:ascii="Open Sans" w:eastAsia="Open Sans" w:hAnsi="Open Sans" w:cs="Open Sans"/>
+                <w:b/>
+                <w:sz w:val="24"/>
+                <w:szCs w:val="24"/>
+              </w:rPr>
+            </w:pPr>
+            <w:r>
+              <w:rPr>
+                <w:rFonts w:ascii="Open Sans" w:eastAsia="Open Sans" w:hAnsi="Open Sans" w:cs="Open Sans"/>
+                <w:b/>
+                <w:sz w:val="24"/>
+                <w:szCs w:val="24"/>
+              </w:rPr>
+              <w:t>restricted</w:t>
+            </w:r>
+          </w:p>
+          <w:p>
+            <w:pPr>
+              <w:numPr>
+                <w:ilvl w:val="0"/>
+                <w:numId w:val="2"/>
+              </w:numPr>
+              <w:rPr>
+                <w:rFonts w:ascii="Open Sans" w:eastAsia="Open Sans" w:hAnsi="Open Sans" w:cs="Open Sans"/>
+                <w:b/>
+                <w:sz w:val="24"/>
+                <w:szCs w:val="24"/>
+              </w:rPr>
+            </w:pPr>
+            <w:r>
+              <w:rPr>
+                <w:rFonts w:ascii="Open Sans" w:eastAsia="Open Sans" w:hAnsi="Open Sans" w:cs="Open Sans"/>
+                <w:b/>
+                <w:sz w:val="24"/>
+                <w:szCs w:val="24"/>
+              </w:rPr>
+              <w:t>data are not available</w:t>
+            </w:r>
+          </w:p>
+          <w:p>
+            <w:pPr>
+              <w:numPr>
+                <w:ilvl w:val="0"/>
+                <w:numId w:val="2"/>
+              </w:numPr>
+              <w:rPr>
+                <w:rFonts w:ascii="Open Sans" w:eastAsia="Open Sans" w:hAnsi="Open Sans" w:cs="Open Sans"/>
+                <w:b/>
+                <w:sz w:val="24"/>
+                <w:szCs w:val="24"/>
+              </w:rPr>
+            </w:pPr>
+            <w:r>
+              <w:rPr>
+                <w:rFonts w:ascii="Open Sans" w:eastAsia="Open Sans" w:hAnsi="Open Sans" w:cs="Open Sans"/>
+                <w:b/>
+                <w:sz w:val="24"/>
+                <w:szCs w:val="24"/>
+              </w:rPr>
+              <w:t>other (please expand)</w:t>
+            </w:r>
+          </w:p>
+        </w:tc>
+        <w:tc>
+          <w:tcPr>
+            <w:tcW w:w="4514" w:type="dxa"/>
+            <w:tcMar>
+              <w:top w:w="100" w:type="dxa"/>
+              <w:left w:w="100" w:type="dxa"/>
+              <w:bottom w:w="100" w:type="dxa"/>
+              <w:right w:w="100" w:type="dxa"/>
+            </w:tcMar>
+          </w:tcPr>
+          <w:p>
+            <w:pPr>
+              <w:widowControl w:val="0"/>
+              <w:pBdr>
+                <w:top w:val="nil"/>
+                <w:left w:val="nil"/>
+                <w:bottom w:val="nil"/>
+                <w:right w:val="nil"/>
+                <w:between w:val="nil"/>
+              </w:pBdr>
+              <w:spacing w:line="240" w:lineRule="auto"/>
+            </w:pPr>
+            <w:r>
+              <w:lastRenderedPageBreak/>
+              <w:t>Restricted</w:t>
+            </w:r>
+          </w:p>
+        </w:tc>
+      </w:tr>
+      <w:tr>
+        <w:tc>
+          <w:tcPr>
+            <w:tcW w:w="4514" w:type="dxa"/>
+            <w:tcMar>
+              <w:top w:w="100" w:type="dxa"/>
+              <w:left w:w="100" w:type="dxa"/>
+              <w:bottom w:w="100" w:type="dxa"/>
+              <w:right w:w="100" w:type="dxa"/>
+            </w:tcMar>
+          </w:tcPr>
+          <w:p>
+            <w:pPr>
+              <w:rPr>
+                <w:b/>
+              </w:rPr>
+            </w:pPr>
+            <w:r>
+              <w:rPr>
+                <w:rFonts w:ascii="Open Sans" w:eastAsia="Open Sans" w:hAnsi="Open Sans" w:cs="Open Sans"/>
+                <w:b/>
+                <w:sz w:val="24"/>
+                <w:szCs w:val="24"/>
+              </w:rPr>
+              <w:t xml:space="preserve">If the data are not publicly available, please explain why not. Please provide documentation of the transparency constraint where possible (e.g., copies of data access </w:t>
+            </w:r>
+            <w:proofErr w:type="gramStart"/>
+            <w:r>
+              <w:rPr>
+                <w:rFonts w:ascii="Open Sans" w:eastAsia="Open Sans" w:hAnsi="Open Sans" w:cs="Open Sans"/>
+                <w:b/>
+                <w:sz w:val="24"/>
+                <w:szCs w:val="24"/>
+              </w:rPr>
+              <w:t>agreements)*</w:t>
+            </w:r>
+            <w:proofErr w:type="gramEnd"/>
+            <w:r>
+              <w:rPr>
+                <w:rFonts w:ascii="Open Sans" w:eastAsia="Open Sans" w:hAnsi="Open Sans" w:cs="Open Sans"/>
+                <w:b/>
+                <w:sz w:val="24"/>
+                <w:szCs w:val="24"/>
+              </w:rPr>
+              <w:t>.</w:t>
+            </w:r>
+          </w:p>
+        </w:tc>
+        <w:tc>
+          <w:tcPr>
+            <w:tcW w:w="4514" w:type="dxa"/>
+            <w:tcMar>
+              <w:top w:w="100" w:type="dxa"/>
+              <w:left w:w="100" w:type="dxa"/>
+              <w:bottom w:w="100" w:type="dxa"/>
+              <w:right w:w="100" w:type="dxa"/>
+            </w:tcMar>
+          </w:tcPr>
+          <w:p>
+            <w:pPr>
+              <w:widowControl w:val="0"/>
+              <w:pBdr>
+                <w:top w:val="nil"/>
+                <w:left w:val="nil"/>
+                <w:bottom w:val="nil"/>
+                <w:right w:val="nil"/>
+                <w:between w:val="nil"/>
+              </w:pBdr>
+              <w:spacing w:line="240" w:lineRule="auto"/>
+            </w:pPr>
+            <w:r>
+              <w:t xml:space="preserve">Altmetric.com does not allow the </w:t>
+            </w:r>
+            <w:r>
+              <w:t>publishing, display or redistribution</w:t>
+            </w:r>
+            <w:r>
+              <w:t xml:space="preserve"> of their data. </w:t>
+            </w:r>
+            <w:r>
+              <w:t> </w:t>
+            </w:r>
+            <w:r>
+              <w:t>More information can be found in the company’s guidelines and terms of use:</w:t>
+            </w:r>
+            <w:r>
+              <w:br/>
+            </w:r>
+            <w:r>
+              <w:br/>
+            </w:r>
+            <w:r>
+              <w:t>https://www.altmetric.com/our-audience/researchers/research-access/request-researcher-access/</w:t>
+            </w:r>
+            <w:r>
+              <w:br/>
+            </w:r>
+            <w:r>
+              <w:br/>
+            </w:r>
+            <w:r>
+              <w:t>https://www.altmetric.com/terms-of-use/</w:t>
+            </w:r>
+          </w:p>
+        </w:tc>
+      </w:tr>
+      <w:tr>
+        <w:tc>
+          <w:tcPr>
+            <w:tcW w:w="4514" w:type="dxa"/>
+            <w:tcMar>
+              <w:top w:w="100" w:type="dxa"/>
+              <w:left w:w="100" w:type="dxa"/>
+              <w:bottom w:w="100" w:type="dxa"/>
+              <w:right w:w="100" w:type="dxa"/>
+            </w:tcMar>
+          </w:tcPr>
+          <w:p>
+            <w:pPr>
+              <w:rPr>
+                <w:rFonts w:ascii="Open Sans" w:eastAsia="Open Sans" w:hAnsi="Open Sans" w:cs="Open Sans"/>
+                <w:b/>
+                <w:sz w:val="24"/>
+                <w:szCs w:val="24"/>
+              </w:rPr>
+            </w:pPr>
+            <w:r>
+              <w:rPr>
+                <w:rFonts w:ascii="Open Sans" w:eastAsia="Open Sans" w:hAnsi="Open Sans" w:cs="Open Sans"/>
+                <w:b/>
+                <w:sz w:val="24"/>
+                <w:szCs w:val="24"/>
+              </w:rPr>
+              <w:t>Provide clear step-by-step instructions explaining how the data were obtained / how an independent researcher could access the data. Ensure that you provide sufficient detail about accessing the *specific data used in the present study*.</w:t>
+            </w:r>
+          </w:p>
+        </w:tc>
+        <w:tc>
+          <w:tcPr>
+            <w:tcW w:w="4514" w:type="dxa"/>
+            <w:tcMar>
+              <w:top w:w="100" w:type="dxa"/>
+              <w:left w:w="100" w:type="dxa"/>
+              <w:bottom w:w="100" w:type="dxa"/>
+              <w:right w:w="100" w:type="dxa"/>
+            </w:tcMar>
+          </w:tcPr>
+          <w:p>
+            <w:pPr>
+              <w:widowControl w:val="0"/>
+              <w:pBdr>
+                <w:top w:val="nil"/>
+                <w:left w:val="nil"/>
+                <w:bottom w:val="nil"/>
+                <w:right w:val="nil"/>
+                <w:between w:val="nil"/>
+              </w:pBdr>
+              <w:spacing w:line="240" w:lineRule="auto"/>
+            </w:pPr>
+            <w:r>
+              <w:t xml:space="preserve">Data </w:t>
+            </w:r>
+            <w:r>
+              <w:t>were</w:t>
+            </w:r>
+            <w:r>
+              <w:t xml:space="preserve"> manually extracted from the Altmetric.com website</w:t>
+            </w:r>
+            <w:r>
+              <w:t xml:space="preserve">, from </w:t>
+            </w:r>
+            <w:r>
+              <w:t>09/23/2024 to 10/01/2024</w:t>
+            </w:r>
+            <w:r>
+              <w:t xml:space="preserve">. </w:t>
+            </w:r>
+            <w:r>
+              <w:t>We extracted a</w:t>
+            </w:r>
+            <w:r>
+              <w:t xml:space="preserve"> list of </w:t>
+            </w:r>
+            <w:r>
+              <w:t xml:space="preserve">all </w:t>
+            </w:r>
+            <w:r>
+              <w:t xml:space="preserve">psychology paper </w:t>
+            </w:r>
+            <w:proofErr w:type="gramStart"/>
+            <w:r>
+              <w:t>DOI’s</w:t>
+            </w:r>
+            <w:proofErr w:type="gramEnd"/>
+            <w:r>
+              <w:t xml:space="preserve"> from</w:t>
+            </w:r>
+            <w:r>
+              <w:t xml:space="preserve"> the</w:t>
+            </w:r>
+            <w:r>
+              <w:t xml:space="preserve"> </w:t>
+            </w:r>
+            <w:proofErr w:type="spellStart"/>
+            <w:r>
+              <w:t>Openalex</w:t>
+            </w:r>
+            <w:proofErr w:type="spellEnd"/>
+            <w:r>
+              <w:t xml:space="preserve"> database</w:t>
+            </w:r>
+            <w:r>
+              <w:t xml:space="preserve">, </w:t>
+            </w:r>
+            <w:r>
+              <w:t>split the list in</w:t>
+            </w:r>
+            <w:r>
+              <w:t xml:space="preserve"> </w:t>
+            </w:r>
+            <w:r>
+              <w:t>batches of 20,000 DOI’s</w:t>
+            </w:r>
+            <w:r>
+              <w:t xml:space="preserve"> (</w:t>
+            </w:r>
+            <w:proofErr w:type="spellStart"/>
+            <w:r>
+              <w:t>Altmetric’s</w:t>
+            </w:r>
+            <w:proofErr w:type="spellEnd"/>
+            <w:r>
+              <w:t xml:space="preserve"> search limit is 25,000) and entered the batches of </w:t>
+            </w:r>
+            <w:proofErr w:type="gramStart"/>
+            <w:r>
+              <w:t>DOI’s</w:t>
+            </w:r>
+            <w:proofErr w:type="gramEnd"/>
+            <w:r>
+              <w:t xml:space="preserve"> into the Altmetric advanced search bar. Then, </w:t>
+            </w:r>
+            <w:r>
+              <w:t xml:space="preserve">we exported the </w:t>
+            </w:r>
+            <w:r>
+              <w:t>search results as .csv files</w:t>
+            </w:r>
+            <w:r>
+              <w:t xml:space="preserve"> and</w:t>
+            </w:r>
+            <w:r>
+              <w:t xml:space="preserve"> combined into a single spreadsheet.</w:t>
+            </w:r>
+          </w:p>
+          <w:p>
+            <w:pPr>
+              <w:widowControl w:val="0"/>
+              <w:pBdr>
+                <w:top w:val="nil"/>
+                <w:left w:val="nil"/>
+                <w:bottom w:val="nil"/>
+                <w:right w:val="nil"/>
+                <w:between w:val="nil"/>
+              </w:pBdr>
+              <w:spacing w:line="240" w:lineRule="auto"/>
+            </w:pPr>
+          </w:p>
+          <w:p>
+            <w:pPr>
+              <w:widowControl w:val="0"/>
+              <w:pBdr>
+                <w:top w:val="nil"/>
+                <w:left w:val="nil"/>
+                <w:bottom w:val="nil"/>
+                <w:right w:val="nil"/>
+                <w:between w:val="nil"/>
+              </w:pBdr>
+              <w:spacing w:line="240" w:lineRule="auto"/>
+            </w:pPr>
+            <w:r>
+              <w:t>An independent researcher could access the data by requesting a password to the encrypted file stored on the OSF, which can only be shared for peer-review purposes.</w:t>
+            </w:r>
+          </w:p>
+        </w:tc>
+      </w:tr>
+      <w:tr>
+        <w:tc>
+          <w:tcPr>
+            <w:tcW w:w="4514" w:type="dxa"/>
+            <w:tcMar>
+              <w:top w:w="100" w:type="dxa"/>
+              <w:left w:w="100" w:type="dxa"/>
+              <w:bottom w:w="100" w:type="dxa"/>
+              <w:right w:w="100" w:type="dxa"/>
+            </w:tcMar>
+          </w:tcPr>
+          <w:p>
+            <w:pPr>
+              <w:rPr>
+                <w:rFonts w:ascii="Open Sans" w:eastAsia="Open Sans" w:hAnsi="Open Sans" w:cs="Open Sans"/>
+                <w:b/>
+                <w:sz w:val="24"/>
+                <w:szCs w:val="24"/>
+              </w:rPr>
+            </w:pPr>
+            <w:r>
+              <w:rPr>
+                <w:rFonts w:ascii="Open Sans" w:eastAsia="Open Sans" w:hAnsi="Open Sans" w:cs="Open Sans"/>
+                <w:b/>
+                <w:sz w:val="24"/>
+                <w:szCs w:val="24"/>
+              </w:rPr>
+              <w:t xml:space="preserve">Are the data stored in a location that qualifies as a </w:t>
+            </w:r>
+            <w:hyperlink r:id="rId12">
+              <w:r>
+                <w:rPr>
+                  <w:rFonts w:ascii="Open Sans" w:eastAsia="Open Sans" w:hAnsi="Open Sans" w:cs="Open Sans"/>
+                  <w:b/>
+                  <w:color w:val="1155CC"/>
+                  <w:sz w:val="24"/>
+                  <w:szCs w:val="24"/>
+                </w:rPr>
+                <w:t>trusted repository</w:t>
+              </w:r>
+            </w:hyperlink>
+            <w:r>
+              <w:rPr>
+                <w:rFonts w:ascii="Open Sans" w:eastAsia="Open Sans" w:hAnsi="Open Sans" w:cs="Open Sans"/>
+                <w:b/>
+                <w:sz w:val="24"/>
+                <w:szCs w:val="24"/>
+              </w:rPr>
+              <w:t>?</w:t>
+            </w:r>
+          </w:p>
+        </w:tc>
+        <w:tc>
+          <w:tcPr>
+            <w:tcW w:w="4514" w:type="dxa"/>
+            <w:tcMar>
+              <w:top w:w="100" w:type="dxa"/>
+              <w:left w:w="100" w:type="dxa"/>
+              <w:bottom w:w="100" w:type="dxa"/>
+              <w:right w:w="100" w:type="dxa"/>
+            </w:tcMar>
+          </w:tcPr>
+          <w:p>
+            <w:pPr>
+              <w:widowControl w:val="0"/>
+              <w:pBdr>
+                <w:top w:val="nil"/>
+                <w:left w:val="nil"/>
+                <w:bottom w:val="nil"/>
+                <w:right w:val="nil"/>
+                <w:between w:val="nil"/>
+              </w:pBdr>
+              <w:spacing w:line="240" w:lineRule="auto"/>
+            </w:pPr>
+          </w:p>
+          <w:p>
+            <w:pPr>
+              <w:jc w:val="center"/>
+            </w:pPr>
+            <w:r>
+              <w:t>Yes</w:t>
+            </w:r>
+          </w:p>
+        </w:tc>
+      </w:tr>
+      <w:tr>
+        <w:tc>
+          <w:tcPr>
+            <w:tcW w:w="4514" w:type="dxa"/>
+            <w:tcMar>
+              <w:top w:w="100" w:type="dxa"/>
+              <w:left w:w="100" w:type="dxa"/>
+              <w:bottom w:w="100" w:type="dxa"/>
+              <w:right w:w="100" w:type="dxa"/>
+            </w:tcMar>
+          </w:tcPr>
+          <w:p>
+            <w:pPr>
+              <w:rPr>
+                <w:rFonts w:ascii="Open Sans" w:eastAsia="Open Sans" w:hAnsi="Open Sans" w:cs="Open Sans"/>
+                <w:b/>
+                <w:sz w:val="24"/>
+                <w:szCs w:val="24"/>
+              </w:rPr>
+            </w:pPr>
+            <w:r>
+              <w:rPr>
+                <w:rFonts w:ascii="Open Sans" w:eastAsia="Open Sans" w:hAnsi="Open Sans" w:cs="Open Sans"/>
+                <w:b/>
+                <w:sz w:val="24"/>
+                <w:szCs w:val="24"/>
+              </w:rPr>
+              <w:t>Please link to documentation that describes the data (e.g., data dictionary or codebook).</w:t>
+            </w:r>
+          </w:p>
+        </w:tc>
+        <w:tc>
+          <w:tcPr>
+            <w:tcW w:w="4514" w:type="dxa"/>
+            <w:tcMar>
+              <w:top w:w="100" w:type="dxa"/>
+              <w:left w:w="100" w:type="dxa"/>
+              <w:bottom w:w="100" w:type="dxa"/>
+              <w:right w:w="100" w:type="dxa"/>
+            </w:tcMar>
+          </w:tcPr>
+          <w:p>
+            <w:pPr>
+              <w:widowControl w:val="0"/>
+              <w:pBdr>
+                <w:top w:val="nil"/>
+                <w:left w:val="nil"/>
+                <w:bottom w:val="nil"/>
+                <w:right w:val="nil"/>
+                <w:between w:val="nil"/>
+              </w:pBdr>
+              <w:spacing w:line="240" w:lineRule="auto"/>
+            </w:pPr>
+            <w:hyperlink r:id="rId13" w:history="1">
+              <w:r>
+                <w:rPr>
+                  <w:rStyle w:val="Hyperlink"/>
+                </w:rPr>
+                <w:t>https://details-page-api-docs.altmetric.com/data-endpoints-counts.html</w:t>
+              </w:r>
+            </w:hyperlink>
+          </w:p>
+        </w:tc>
+      </w:tr>
+      <w:tr>
+        <w:tc>
+          <w:tcPr>
+            <w:tcW w:w="4514" w:type="dxa"/>
+            <w:tcMar>
+              <w:top w:w="100" w:type="dxa"/>
+              <w:left w:w="100" w:type="dxa"/>
+              <w:bottom w:w="100" w:type="dxa"/>
+              <w:right w:w="100" w:type="dxa"/>
+            </w:tcMar>
+          </w:tcPr>
+          <w:p>
+            <w:pPr>
+              <w:rPr>
+                <w:rFonts w:ascii="Open Sans" w:eastAsia="Open Sans" w:hAnsi="Open Sans" w:cs="Open Sans"/>
+                <w:b/>
+                <w:sz w:val="24"/>
+                <w:szCs w:val="24"/>
+              </w:rPr>
+            </w:pPr>
+            <w:r>
+              <w:rPr>
+                <w:rFonts w:ascii="Open Sans" w:eastAsia="Open Sans" w:hAnsi="Open Sans" w:cs="Open Sans"/>
+                <w:b/>
+                <w:sz w:val="24"/>
+                <w:szCs w:val="24"/>
+              </w:rPr>
+              <w:t>If there are materials relevant to acquisition of this data (e.g., survey instruments) please link to them. Please also link to documentation that describes the materials.</w:t>
+            </w:r>
+          </w:p>
+        </w:tc>
+        <w:tc>
+          <w:tcPr>
+            <w:tcW w:w="4514" w:type="dxa"/>
+            <w:tcMar>
+              <w:top w:w="100" w:type="dxa"/>
+              <w:left w:w="100" w:type="dxa"/>
+              <w:bottom w:w="100" w:type="dxa"/>
+              <w:right w:w="100" w:type="dxa"/>
+            </w:tcMar>
+          </w:tcPr>
+          <w:p>
+            <w:pPr>
+              <w:widowControl w:val="0"/>
+              <w:pBdr>
+                <w:top w:val="nil"/>
+                <w:left w:val="nil"/>
+                <w:bottom w:val="nil"/>
+                <w:right w:val="nil"/>
+                <w:between w:val="nil"/>
+              </w:pBdr>
+              <w:spacing w:line="240" w:lineRule="auto"/>
+            </w:pPr>
+            <w:r>
+              <w:t>N/A</w:t>
+            </w:r>
+          </w:p>
+        </w:tc>
+      </w:tr>
+      <w:tr>
+        <w:tc>
+          <w:tcPr>
+            <w:tcW w:w="4514" w:type="dxa"/>
+            <w:tcMar>
+              <w:top w:w="100" w:type="dxa"/>
+              <w:left w:w="100" w:type="dxa"/>
+              <w:bottom w:w="100" w:type="dxa"/>
+              <w:right w:w="100" w:type="dxa"/>
+            </w:tcMar>
+          </w:tcPr>
+          <w:p>
+            <w:pPr>
+              <w:rPr>
+                <w:rFonts w:ascii="Open Sans" w:eastAsia="Open Sans" w:hAnsi="Open Sans" w:cs="Open Sans"/>
+                <w:b/>
+                <w:sz w:val="24"/>
+                <w:szCs w:val="24"/>
+              </w:rPr>
+            </w:pPr>
+            <w:r>
+              <w:rPr>
+                <w:rFonts w:ascii="Open Sans" w:eastAsia="Open Sans" w:hAnsi="Open Sans" w:cs="Open Sans"/>
+                <w:b/>
+                <w:sz w:val="24"/>
+                <w:szCs w:val="24"/>
+              </w:rPr>
+              <w:t>Other information about these data.</w:t>
+            </w:r>
+          </w:p>
+        </w:tc>
+        <w:tc>
+          <w:tcPr>
+            <w:tcW w:w="4514" w:type="dxa"/>
+            <w:tcMar>
+              <w:top w:w="100" w:type="dxa"/>
+              <w:left w:w="100" w:type="dxa"/>
+              <w:bottom w:w="100" w:type="dxa"/>
+              <w:right w:w="100" w:type="dxa"/>
+            </w:tcMar>
+          </w:tcPr>
+          <w:p>
+            <w:pPr>
+              <w:widowControl w:val="0"/>
+              <w:pBdr>
+                <w:top w:val="nil"/>
+                <w:left w:val="nil"/>
+                <w:bottom w:val="nil"/>
+                <w:right w:val="nil"/>
+                <w:between w:val="nil"/>
+              </w:pBdr>
+              <w:spacing w:line="240" w:lineRule="auto"/>
+            </w:pPr>
+            <w:r>
+              <w:t>N/A</w:t>
+            </w:r>
+          </w:p>
+        </w:tc>
+      </w:tr>
+    </w:tbl>
+    <w:p/>
+    <w:p>
+      <w:pPr>
+        <w:rPr>
+          <w:rFonts w:ascii="Open Sans" w:eastAsia="Open Sans" w:hAnsi="Open Sans" w:cs="Open Sans"/>
+          <w:color w:val="1F1F1F"/>
+        </w:rPr>
+      </w:pPr>
+      <w:r>
+        <w:rPr>
+          <w:rFonts w:ascii="Open Sans" w:eastAsia="Open Sans" w:hAnsi="Open Sans" w:cs="Open Sans"/>
+        </w:rPr>
+        <w:lastRenderedPageBreak/>
+        <w:t>*Ideally link to publicly available documentation. Private documentation can be shared with the journal’s STAR Team (</w:t>
+      </w:r>
+      <w:hyperlink r:id="rId14" w:history="1">
+        <w:r>
+          <w:rPr>
+            <w:rStyle w:val="Hyperlink"/>
+            <w:rFonts w:ascii="Open Sans" w:eastAsia="Open Sans" w:hAnsi="Open Sans" w:cs="Open Sans"/>
+          </w:rPr>
+          <w:t>psych.star.team@gmail.com</w:t>
+        </w:r>
+      </w:hyperlink>
+      <w:r>
+        <w:rPr>
+          <w:rFonts w:ascii="Open Sans" w:eastAsia="Open Sans" w:hAnsi="Open Sans" w:cs="Open Sans"/>
+          <w:color w:val="1F1F1F"/>
+        </w:rPr>
+        <w:t>).</w:t>
+      </w:r>
+    </w:p>
+    <w:p>
+      <w:pPr>
+        <w:rPr>
+          <w:rFonts w:ascii="Open Sans" w:eastAsia="Open Sans" w:hAnsi="Open Sans" w:cs="Open Sans"/>
+          <w:color w:val="1F1F1F"/>
+        </w:rPr>
+      </w:pPr>
+    </w:p>
+    <w:p>
+      <w:pPr>
+        <w:rPr>
+          <w:rFonts w:ascii="Open Sans" w:eastAsia="Open Sans" w:hAnsi="Open Sans" w:cs="Open Sans"/>
+        </w:rPr>
+      </w:pPr>
+    </w:p>
+    <w:p>
+      <w:pPr>
+        <w:rPr>
+          <w:rFonts w:ascii="Open Sans" w:eastAsia="Open Sans" w:hAnsi="Open Sans" w:cs="Open Sans"/>
+          <w:sz w:val="24"/>
+          <w:szCs w:val="24"/>
+        </w:rPr>
+      </w:pPr>
+      <w:r>
+        <w:rPr>
+          <w:rFonts w:ascii="Open Sans" w:eastAsia="Open Sans" w:hAnsi="Open Sans" w:cs="Open Sans"/>
+          <w:b/>
+          <w:sz w:val="24"/>
+          <w:szCs w:val="24"/>
+        </w:rPr>
+        <w:t xml:space="preserve">Table </w:t>
+      </w:r>
+      <w:r>
+        <w:rPr>
+          <w:rFonts w:ascii="Open Sans" w:eastAsia="Open Sans" w:hAnsi="Open Sans" w:cs="Open Sans"/>
+          <w:b/>
+          <w:sz w:val="24"/>
+          <w:szCs w:val="24"/>
+        </w:rPr>
+        <w:t>3</w:t>
+      </w:r>
+      <w:r>
+        <w:rPr>
+          <w:rFonts w:ascii="Open Sans" w:eastAsia="Open Sans" w:hAnsi="Open Sans" w:cs="Open Sans"/>
+          <w:b/>
+          <w:sz w:val="24"/>
+          <w:szCs w:val="24"/>
+        </w:rPr>
+        <w:t xml:space="preserve">. </w:t>
+      </w:r>
+      <w:r>
+        <w:rPr>
+          <w:rFonts w:ascii="Open Sans" w:eastAsia="Open Sans" w:hAnsi="Open Sans" w:cs="Open Sans"/>
+          <w:sz w:val="24"/>
+          <w:szCs w:val="24"/>
+        </w:rPr>
+        <w:t xml:space="preserve">Transparency form for </w:t>
+      </w:r>
+      <w:proofErr w:type="spellStart"/>
+      <w:r>
+        <w:rPr>
+          <w:rFonts w:ascii="Open Sans" w:eastAsia="Open Sans" w:hAnsi="Open Sans" w:cs="Open Sans"/>
+          <w:sz w:val="24"/>
+          <w:szCs w:val="24"/>
+        </w:rPr>
+        <w:t>PsycInfo</w:t>
+      </w:r>
+      <w:proofErr w:type="spellEnd"/>
+      <w:r>
+        <w:rPr>
+          <w:rFonts w:ascii="Open Sans" w:eastAsia="Open Sans" w:hAnsi="Open Sans" w:cs="Open Sans"/>
+          <w:sz w:val="24"/>
+          <w:szCs w:val="24"/>
+        </w:rPr>
+        <w:t xml:space="preserve"> data.</w:t>
+      </w:r>
+    </w:p>
+    <w:p/>
+    <w:tbl>
+      <w:tblPr>
+        <w:tblStyle w:val="a0"/>
+        <w:tblW w:w="9029" w:type="dxa"/>
+        <w:tblInd w:w="0" w:type="dxa"/>
+        <w:tblBorders>
+          <w:top w:val="single" w:sz="8" w:space="0" w:color="000000"/>
+          <w:left w:val="single" w:sz="8" w:space="0" w:color="000000"/>
+          <w:bottom w:val="single" w:sz="8" w:space="0" w:color="000000"/>
+          <w:right w:val="single" w:sz="8" w:space="0" w:color="000000"/>
+          <w:insideH w:val="single" w:sz="8" w:space="0" w:color="000000"/>
+          <w:insideV w:val="single" w:sz="8" w:space="0" w:color="000000"/>
+        </w:tblBorders>
+        <w:tblLayout w:type="fixed"/>
+        <w:tblLook w:val="0600" w:firstRow="0" w:lastRow="0" w:firstColumn="0" w:lastColumn="0" w:noHBand="1" w:noVBand="1"/>
+      </w:tblPr>
+      <w:tblGrid>
+        <w:gridCol w:w="4514"/>
+        <w:gridCol w:w="4515"/>
+      </w:tblGrid>
+      <w:tr>
+        <w:tc>
+          <w:tcPr>
+            <w:tcW w:w="4514" w:type="dxa"/>
+            <w:tcMar>
+              <w:top w:w="100" w:type="dxa"/>
+              <w:left w:w="100" w:type="dxa"/>
+              <w:bottom w:w="100" w:type="dxa"/>
+              <w:right w:w="100" w:type="dxa"/>
+            </w:tcMar>
+          </w:tcPr>
+          <w:p>
+            <w:pPr>
+              <w:rPr>
+                <w:b/>
+              </w:rPr>
+            </w:pPr>
+            <w:r>
+              <w:rPr>
+                <w:rFonts w:ascii="Open Sans" w:eastAsia="Open Sans" w:hAnsi="Open Sans" w:cs="Open Sans"/>
+                <w:b/>
+                <w:sz w:val="24"/>
+                <w:szCs w:val="24"/>
+              </w:rPr>
+              <w:t>Name and/or source of data</w:t>
+            </w:r>
+          </w:p>
+        </w:tc>
+        <w:tc>
+          <w:tcPr>
+            <w:tcW w:w="4514" w:type="dxa"/>
+            <w:tcMar>
+              <w:top w:w="100" w:type="dxa"/>
+              <w:left w:w="100" w:type="dxa"/>
+              <w:bottom w:w="100" w:type="dxa"/>
+              <w:right w:w="100" w:type="dxa"/>
+            </w:tcMar>
+          </w:tcPr>
+          <w:p>
+            <w:pPr>
+              <w:widowControl w:val="0"/>
+              <w:pBdr>
+                <w:top w:val="nil"/>
+                <w:left w:val="nil"/>
+                <w:bottom w:val="nil"/>
+                <w:right w:val="nil"/>
+                <w:between w:val="nil"/>
+              </w:pBdr>
+              <w:spacing w:line="240" w:lineRule="auto"/>
+            </w:pPr>
+            <w:r>
+              <w:t xml:space="preserve">APA </w:t>
+            </w:r>
+            <w:proofErr w:type="spellStart"/>
+            <w:r>
+              <w:t>PsycInfo</w:t>
+            </w:r>
+            <w:proofErr w:type="spellEnd"/>
+            <w:r>
+              <w:t xml:space="preserve"> data</w:t>
+            </w:r>
+            <w:r>
+              <w:t>base</w:t>
+            </w:r>
+          </w:p>
+        </w:tc>
+      </w:tr>
+      <w:tr>
+        <w:tc>
+          <w:tcPr>
+            <w:tcW w:w="4514" w:type="dxa"/>
+            <w:tcMar>
+              <w:top w:w="100" w:type="dxa"/>
+              <w:left w:w="100" w:type="dxa"/>
+              <w:bottom w:w="100" w:type="dxa"/>
+              <w:right w:w="100" w:type="dxa"/>
+            </w:tcMar>
+          </w:tcPr>
+          <w:p>
+            <w:pPr>
+              <w:rPr>
+                <w:b/>
+              </w:rPr>
+            </w:pPr>
+            <w:r>
+              <w:rPr>
+                <w:rFonts w:ascii="Open Sans" w:eastAsia="Open Sans" w:hAnsi="Open Sans" w:cs="Open Sans"/>
+                <w:b/>
+                <w:sz w:val="24"/>
+                <w:szCs w:val="24"/>
+              </w:rPr>
+              <w:t>Name of individual(s) / organisation that controls the data</w:t>
+            </w:r>
+          </w:p>
+        </w:tc>
+        <w:tc>
+          <w:tcPr>
+            <w:tcW w:w="4514" w:type="dxa"/>
+            <w:tcMar>
+              <w:top w:w="100" w:type="dxa"/>
+              <w:left w:w="100" w:type="dxa"/>
+              <w:bottom w:w="100" w:type="dxa"/>
+              <w:right w:w="100" w:type="dxa"/>
+            </w:tcMar>
+          </w:tcPr>
+          <w:p>
+            <w:pPr>
+              <w:widowControl w:val="0"/>
+              <w:pBdr>
+                <w:top w:val="nil"/>
+                <w:left w:val="nil"/>
+                <w:bottom w:val="nil"/>
+                <w:right w:val="nil"/>
+                <w:between w:val="nil"/>
+              </w:pBdr>
+              <w:spacing w:line="240" w:lineRule="auto"/>
+            </w:pPr>
+            <w:r>
+              <w:t>American Psychological Association</w:t>
+            </w:r>
+          </w:p>
+        </w:tc>
+      </w:tr>
+      <w:tr>
+        <w:tc>
+          <w:tcPr>
+            <w:tcW w:w="4514" w:type="dxa"/>
+            <w:tcMar>
+              <w:top w:w="100" w:type="dxa"/>
+              <w:left w:w="100" w:type="dxa"/>
+              <w:bottom w:w="100" w:type="dxa"/>
+              <w:right w:w="100" w:type="dxa"/>
+            </w:tcMar>
+          </w:tcPr>
+          <w:p>
+            <w:pPr>
+              <w:rPr>
+                <w:rFonts w:ascii="Open Sans" w:eastAsia="Open Sans" w:hAnsi="Open Sans" w:cs="Open Sans"/>
+                <w:b/>
+                <w:sz w:val="24"/>
+                <w:szCs w:val="24"/>
+              </w:rPr>
+            </w:pPr>
+            <w:r>
+              <w:rPr>
+                <w:rFonts w:ascii="Open Sans" w:eastAsia="Open Sans" w:hAnsi="Open Sans" w:cs="Open Sans"/>
+                <w:b/>
+                <w:sz w:val="24"/>
+                <w:szCs w:val="24"/>
+              </w:rPr>
+              <w:t>Name of author(s) who obtained the data from the third party</w:t>
+            </w:r>
+          </w:p>
+        </w:tc>
+        <w:tc>
+          <w:tcPr>
+            <w:tcW w:w="4514" w:type="dxa"/>
+            <w:tcMar>
+              <w:top w:w="100" w:type="dxa"/>
+              <w:left w:w="100" w:type="dxa"/>
+              <w:bottom w:w="100" w:type="dxa"/>
+              <w:right w:w="100" w:type="dxa"/>
+            </w:tcMar>
+          </w:tcPr>
+          <w:p>
+            <w:pPr>
+              <w:widowControl w:val="0"/>
+              <w:pBdr>
+                <w:top w:val="nil"/>
+                <w:left w:val="nil"/>
+                <w:bottom w:val="nil"/>
+                <w:right w:val="nil"/>
+                <w:between w:val="nil"/>
+              </w:pBdr>
+              <w:spacing w:line="240" w:lineRule="auto"/>
+              <w:rPr>
+                <w:lang w:val="en-US"/>
+              </w:rPr>
+            </w:pPr>
+            <w:r>
+              <w:rPr>
+                <w:lang w:val="en-US"/>
+              </w:rPr>
+              <w:t>Nicholas A. Coles</w:t>
+            </w:r>
+            <w:r>
+              <w:rPr>
+                <w:lang w:val="en-US"/>
+              </w:rPr>
+              <w:t>, Joao Takayanagi, Gabrielle</w:t>
+            </w:r>
+            <w:r>
+              <w:rPr>
+                <w:lang w:val="en-US"/>
+              </w:rPr>
+              <w:t xml:space="preserve"> Grant</w:t>
+            </w:r>
+          </w:p>
+        </w:tc>
+      </w:tr>
+      <w:tr>
+        <w:tc>
+          <w:tcPr>
+            <w:tcW w:w="4514" w:type="dxa"/>
+            <w:tcMar>
+              <w:top w:w="100" w:type="dxa"/>
+              <w:left w:w="100" w:type="dxa"/>
+              <w:bottom w:w="100" w:type="dxa"/>
+              <w:right w:w="100" w:type="dxa"/>
+            </w:tcMar>
+          </w:tcPr>
+          <w:p>
+            <w:pPr>
+              <w:rPr>
+                <w:rFonts w:ascii="Open Sans" w:eastAsia="Open Sans" w:hAnsi="Open Sans" w:cs="Open Sans"/>
+                <w:b/>
+                <w:sz w:val="24"/>
+                <w:szCs w:val="24"/>
+              </w:rPr>
+            </w:pPr>
+            <w:r>
+              <w:rPr>
+                <w:rFonts w:ascii="Open Sans" w:eastAsia="Open Sans" w:hAnsi="Open Sans" w:cs="Open Sans"/>
+                <w:b/>
+                <w:sz w:val="24"/>
+                <w:szCs w:val="24"/>
+              </w:rPr>
+              <w:t>If relevant, provide a citation to the data here and in the manuscript.</w:t>
+            </w:r>
+          </w:p>
+        </w:tc>
+        <w:tc>
+          <w:tcPr>
+            <w:tcW w:w="4514" w:type="dxa"/>
+            <w:tcMar>
+              <w:top w:w="100" w:type="dxa"/>
+              <w:left w:w="100" w:type="dxa"/>
+              <w:bottom w:w="100" w:type="dxa"/>
+              <w:right w:w="100" w:type="dxa"/>
+            </w:tcMar>
+          </w:tcPr>
+          <w:p>
+            <w:pPr>
+              <w:widowControl w:val="0"/>
+              <w:pBdr>
+                <w:top w:val="nil"/>
+                <w:left w:val="nil"/>
+                <w:bottom w:val="nil"/>
+                <w:right w:val="nil"/>
+                <w:between w:val="nil"/>
+              </w:pBdr>
+              <w:spacing w:line="240" w:lineRule="auto"/>
+            </w:pPr>
+            <w:r>
+              <w:rPr>
+                <w:lang w:val="en-US"/>
+              </w:rPr>
+              <w:t xml:space="preserve">American Psychological Association. (n.d.). APA </w:t>
+            </w:r>
+            <w:proofErr w:type="spellStart"/>
+            <w:r>
+              <w:rPr>
+                <w:lang w:val="en-US"/>
+              </w:rPr>
+              <w:t>PsycInfo</w:t>
+            </w:r>
+            <w:proofErr w:type="spellEnd"/>
+            <w:r>
+              <w:rPr>
+                <w:lang w:val="en-US"/>
+              </w:rPr>
+              <w:t xml:space="preserve"> [Database]. </w:t>
+            </w:r>
+            <w:r>
+              <w:rPr>
+                <w:lang w:val="pt-BR"/>
+              </w:rPr>
+              <w:t>APA. https://www.apa.org/pubs/databases/psycinfo</w:t>
+            </w:r>
+          </w:p>
+        </w:tc>
+      </w:tr>
+      <w:tr>
+        <w:tc>
+          <w:tcPr>
+            <w:tcW w:w="4514" w:type="dxa"/>
+            <w:tcMar>
+              <w:top w:w="100" w:type="dxa"/>
+              <w:left w:w="100" w:type="dxa"/>
+              <w:bottom w:w="100" w:type="dxa"/>
+              <w:right w:w="100" w:type="dxa"/>
+            </w:tcMar>
+          </w:tcPr>
+          <w:p>
+            <w:pPr>
+              <w:rPr>
+                <w:rFonts w:ascii="Open Sans" w:eastAsia="Open Sans" w:hAnsi="Open Sans" w:cs="Open Sans"/>
+                <w:b/>
+                <w:sz w:val="24"/>
+                <w:szCs w:val="24"/>
+              </w:rPr>
+            </w:pPr>
+            <w:r>
+              <w:rPr>
+                <w:rFonts w:ascii="Open Sans" w:eastAsia="Open Sans" w:hAnsi="Open Sans" w:cs="Open Sans"/>
+                <w:b/>
+                <w:sz w:val="24"/>
+                <w:szCs w:val="24"/>
+              </w:rPr>
+              <w:t>Is access to the data…</w:t>
+            </w:r>
+          </w:p>
+          <w:p>
+            <w:pPr>
+              <w:numPr>
+                <w:ilvl w:val="0"/>
+                <w:numId w:val="2"/>
+              </w:numPr>
+              <w:rPr>
+                <w:rFonts w:ascii="Open Sans" w:eastAsia="Open Sans" w:hAnsi="Open Sans" w:cs="Open Sans"/>
+                <w:b/>
+                <w:sz w:val="24"/>
+                <w:szCs w:val="24"/>
+              </w:rPr>
+            </w:pPr>
+            <w:r>
+              <w:rPr>
+                <w:rFonts w:ascii="Open Sans" w:eastAsia="Open Sans" w:hAnsi="Open Sans" w:cs="Open Sans"/>
+                <w:b/>
+                <w:sz w:val="24"/>
+                <w:szCs w:val="24"/>
+              </w:rPr>
+              <w:t>public</w:t>
+            </w:r>
+          </w:p>
+          <w:p>
+            <w:pPr>
+              <w:numPr>
+                <w:ilvl w:val="0"/>
+                <w:numId w:val="2"/>
+              </w:numPr>
+              <w:rPr>
+                <w:rFonts w:ascii="Open Sans" w:eastAsia="Open Sans" w:hAnsi="Open Sans" w:cs="Open Sans"/>
+                <w:b/>
+                <w:sz w:val="24"/>
+                <w:szCs w:val="24"/>
+              </w:rPr>
+            </w:pPr>
+            <w:r>
+              <w:rPr>
+                <w:rFonts w:ascii="Open Sans" w:eastAsia="Open Sans" w:hAnsi="Open Sans" w:cs="Open Sans"/>
+                <w:b/>
+                <w:sz w:val="24"/>
+                <w:szCs w:val="24"/>
+              </w:rPr>
+              <w:t>restricted</w:t>
+            </w:r>
+          </w:p>
+          <w:p>
+            <w:pPr>
+              <w:numPr>
+                <w:ilvl w:val="0"/>
+                <w:numId w:val="2"/>
+              </w:numPr>
+              <w:rPr>
+                <w:rFonts w:ascii="Open Sans" w:eastAsia="Open Sans" w:hAnsi="Open Sans" w:cs="Open Sans"/>
+                <w:b/>
+                <w:sz w:val="24"/>
+                <w:szCs w:val="24"/>
+              </w:rPr>
+            </w:pPr>
+            <w:r>
+              <w:rPr>
+                <w:rFonts w:ascii="Open Sans" w:eastAsia="Open Sans" w:hAnsi="Open Sans" w:cs="Open Sans"/>
+                <w:b/>
+                <w:sz w:val="24"/>
+                <w:szCs w:val="24"/>
+              </w:rPr>
+              <w:t>data are not available</w:t>
+            </w:r>
+          </w:p>
+          <w:p>
+            <w:pPr>
+              <w:numPr>
+                <w:ilvl w:val="0"/>
+                <w:numId w:val="2"/>
+              </w:numPr>
+              <w:rPr>
+                <w:rFonts w:ascii="Open Sans" w:eastAsia="Open Sans" w:hAnsi="Open Sans" w:cs="Open Sans"/>
+                <w:b/>
+                <w:sz w:val="24"/>
+                <w:szCs w:val="24"/>
+              </w:rPr>
+            </w:pPr>
+            <w:r>
+              <w:rPr>
+                <w:rFonts w:ascii="Open Sans" w:eastAsia="Open Sans" w:hAnsi="Open Sans" w:cs="Open Sans"/>
+                <w:b/>
+                <w:sz w:val="24"/>
+                <w:szCs w:val="24"/>
+              </w:rPr>
+              <w:t>other (please expand)</w:t>
+            </w:r>
+          </w:p>
+        </w:tc>
+        <w:tc>
+          <w:tcPr>
+            <w:tcW w:w="4514" w:type="dxa"/>
+            <w:tcMar>
+              <w:top w:w="100" w:type="dxa"/>
+              <w:left w:w="100" w:type="dxa"/>
+              <w:bottom w:w="100" w:type="dxa"/>
+              <w:right w:w="100" w:type="dxa"/>
+            </w:tcMar>
+          </w:tcPr>
+          <w:p>
+            <w:pPr>
+              <w:widowControl w:val="0"/>
+              <w:pBdr>
+                <w:top w:val="nil"/>
+                <w:left w:val="nil"/>
+                <w:bottom w:val="nil"/>
+                <w:right w:val="nil"/>
+                <w:between w:val="nil"/>
+              </w:pBdr>
+              <w:spacing w:line="240" w:lineRule="auto"/>
+            </w:pPr>
+            <w:r>
+              <w:t>Restricted</w:t>
+            </w:r>
+          </w:p>
+        </w:tc>
+      </w:tr>
+      <w:tr>
+        <w:tc>
+          <w:tcPr>
+            <w:tcW w:w="4514" w:type="dxa"/>
+            <w:tcMar>
+              <w:top w:w="100" w:type="dxa"/>
+              <w:left w:w="100" w:type="dxa"/>
+              <w:bottom w:w="100" w:type="dxa"/>
+              <w:right w:w="100" w:type="dxa"/>
+            </w:tcMar>
+          </w:tcPr>
+          <w:p>
+            <w:pPr>
+              <w:rPr>
+                <w:b/>
+              </w:rPr>
+            </w:pPr>
+            <w:r>
+              <w:rPr>
+                <w:rFonts w:ascii="Open Sans" w:eastAsia="Open Sans" w:hAnsi="Open Sans" w:cs="Open Sans"/>
+                <w:b/>
+                <w:sz w:val="24"/>
+                <w:szCs w:val="24"/>
+              </w:rPr>
+              <w:t xml:space="preserve">If the data are not publicly available, please explain why not. Please provide documentation of the transparency constraint where possible (e.g., copies of data access </w:t>
+            </w:r>
+            <w:proofErr w:type="gramStart"/>
+            <w:r>
+              <w:rPr>
+                <w:rFonts w:ascii="Open Sans" w:eastAsia="Open Sans" w:hAnsi="Open Sans" w:cs="Open Sans"/>
+                <w:b/>
+                <w:sz w:val="24"/>
+                <w:szCs w:val="24"/>
+              </w:rPr>
+              <w:t>agreements)*</w:t>
+            </w:r>
+            <w:proofErr w:type="gramEnd"/>
+            <w:r>
+              <w:rPr>
+                <w:rFonts w:ascii="Open Sans" w:eastAsia="Open Sans" w:hAnsi="Open Sans" w:cs="Open Sans"/>
+                <w:b/>
+                <w:sz w:val="24"/>
+                <w:szCs w:val="24"/>
+              </w:rPr>
+              <w:t>.</w:t>
+            </w:r>
+          </w:p>
+        </w:tc>
+        <w:tc>
+          <w:tcPr>
+            <w:tcW w:w="4514" w:type="dxa"/>
+            <w:tcMar>
+              <w:top w:w="100" w:type="dxa"/>
+              <w:left w:w="100" w:type="dxa"/>
+              <w:bottom w:w="100" w:type="dxa"/>
+              <w:right w:w="100" w:type="dxa"/>
+            </w:tcMar>
+          </w:tcPr>
+          <w:p>
+            <w:pPr>
+              <w:widowControl w:val="0"/>
+              <w:pBdr>
+                <w:top w:val="nil"/>
+                <w:left w:val="nil"/>
+                <w:bottom w:val="nil"/>
+                <w:right w:val="nil"/>
+                <w:between w:val="nil"/>
+              </w:pBdr>
+              <w:spacing w:line="240" w:lineRule="auto"/>
+            </w:pPr>
+            <w:r>
+              <w:t xml:space="preserve">To access the </w:t>
+            </w:r>
+            <w:proofErr w:type="spellStart"/>
+            <w:r>
+              <w:t>PsycInfo</w:t>
+            </w:r>
+            <w:proofErr w:type="spellEnd"/>
+            <w:r>
+              <w:t xml:space="preserve"> database, users require a license. However, a</w:t>
+            </w:r>
+            <w:r>
+              <w:t xml:space="preserve">uthorized </w:t>
+            </w:r>
+            <w:r>
+              <w:t>u</w:t>
+            </w:r>
+            <w:r>
+              <w:t>sers may extract or use a reasonable amount of information contained in the database for educational, scientific, or research purposes, including extraction and manipulation of information for the purpose of illustration, explanation, example, comment, criticism, teaching, research, or analysis.</w:t>
+            </w:r>
+            <w:r>
+              <w:t xml:space="preserve"> </w:t>
+            </w:r>
+          </w:p>
+          <w:p>
+            <w:pPr>
+              <w:widowControl w:val="0"/>
+              <w:pBdr>
+                <w:top w:val="nil"/>
+                <w:left w:val="nil"/>
+                <w:bottom w:val="nil"/>
+                <w:right w:val="nil"/>
+                <w:between w:val="nil"/>
+              </w:pBdr>
+              <w:spacing w:line="240" w:lineRule="auto"/>
+            </w:pPr>
+          </w:p>
+          <w:p>
+            <w:pPr>
+              <w:widowControl w:val="0"/>
+              <w:pBdr>
+                <w:top w:val="nil"/>
+                <w:left w:val="nil"/>
+                <w:bottom w:val="nil"/>
+                <w:right w:val="nil"/>
+                <w:between w:val="nil"/>
+              </w:pBdr>
+              <w:spacing w:line="240" w:lineRule="auto"/>
+            </w:pPr>
+            <w:r>
+              <w:t>https://www.apa.org/pubs/librarians/licenses/terms-and-conditions</w:t>
+            </w:r>
+          </w:p>
+        </w:tc>
+      </w:tr>
+      <w:tr>
+        <w:tc>
+          <w:tcPr>
+            <w:tcW w:w="4514" w:type="dxa"/>
+            <w:tcMar>
+              <w:top w:w="100" w:type="dxa"/>
+              <w:left w:w="100" w:type="dxa"/>
+              <w:bottom w:w="100" w:type="dxa"/>
+              <w:right w:w="100" w:type="dxa"/>
+            </w:tcMar>
+          </w:tcPr>
+          <w:p>
+            <w:pPr>
+              <w:rPr>
+                <w:rFonts w:ascii="Open Sans" w:eastAsia="Open Sans" w:hAnsi="Open Sans" w:cs="Open Sans"/>
+                <w:b/>
+                <w:sz w:val="24"/>
+                <w:szCs w:val="24"/>
+              </w:rPr>
+            </w:pPr>
+            <w:r>
+              <w:rPr>
+                <w:rFonts w:ascii="Open Sans" w:eastAsia="Open Sans" w:hAnsi="Open Sans" w:cs="Open Sans"/>
+                <w:b/>
+                <w:sz w:val="24"/>
+                <w:szCs w:val="24"/>
+              </w:rPr>
+              <w:t xml:space="preserve">Provide clear step-by-step instructions explaining how the data were obtained / how an independent researcher could access the data. Ensure that you provide sufficient detail about </w:t>
+            </w:r>
+            <w:r>
+              <w:rPr>
+                <w:rFonts w:ascii="Open Sans" w:eastAsia="Open Sans" w:hAnsi="Open Sans" w:cs="Open Sans"/>
+                <w:b/>
+                <w:sz w:val="24"/>
+                <w:szCs w:val="24"/>
+              </w:rPr>
+              <w:lastRenderedPageBreak/>
+              <w:t>accessing the *specific data used in the present study*.</w:t>
+            </w:r>
+          </w:p>
+        </w:tc>
+        <w:tc>
+          <w:tcPr>
+            <w:tcW w:w="4514" w:type="dxa"/>
+            <w:tcMar>
+              <w:top w:w="100" w:type="dxa"/>
+              <w:left w:w="100" w:type="dxa"/>
+              <w:bottom w:w="100" w:type="dxa"/>
+              <w:right w:w="100" w:type="dxa"/>
+            </w:tcMar>
+          </w:tcPr>
+          <w:p>
+            <w:pPr>
+              <w:widowControl w:val="0"/>
+              <w:pBdr>
+                <w:top w:val="nil"/>
+                <w:left w:val="nil"/>
+                <w:bottom w:val="nil"/>
+                <w:right w:val="nil"/>
+                <w:between w:val="nil"/>
+              </w:pBdr>
+              <w:spacing w:line="240" w:lineRule="auto"/>
+            </w:pPr>
+            <w:r>
+              <w:lastRenderedPageBreak/>
+              <w:t xml:space="preserve">First, we categorized the filtered OpenAlex data in bins according to the number of authors </w:t>
+            </w:r>
+            <w:r>
+              <w:t>in</w:t>
+            </w:r>
+            <w:r>
+              <w:t xml:space="preserve"> the paper (1-4 authors, 5-9 authors, 10-19 authors, 20-29 authors, 30-39 authors, and so on). Next, we randomly sampled 300 papers from each bin and </w:t>
+            </w:r>
+            <w:r>
+              <w:t>created a list of</w:t>
+            </w:r>
+            <w:r>
+              <w:t xml:space="preserve"> the</w:t>
+            </w:r>
+            <w:r>
+              <w:t>ir</w:t>
+            </w:r>
+            <w:r>
+              <w:t xml:space="preserve"> DOI</w:t>
+            </w:r>
+            <w:r>
+              <w:t>s</w:t>
+            </w:r>
+            <w:r>
+              <w:t xml:space="preserve">. Finally, we manually entered </w:t>
+            </w:r>
+            <w:r>
+              <w:t>each</w:t>
+            </w:r>
+            <w:r>
+              <w:t xml:space="preserve"> DOI in the </w:t>
+            </w:r>
+            <w:proofErr w:type="spellStart"/>
+            <w:r>
+              <w:t>PsycInfo</w:t>
+            </w:r>
+            <w:proofErr w:type="spellEnd"/>
+            <w:r>
+              <w:t xml:space="preserve"> database</w:t>
+            </w:r>
+            <w:r>
+              <w:t xml:space="preserve"> search tool</w:t>
+            </w:r>
+            <w:r>
+              <w:t xml:space="preserve">, </w:t>
+            </w:r>
+            <w:r>
+              <w:t>extracted</w:t>
+            </w:r>
+            <w:r>
+              <w:t xml:space="preserve"> the APA </w:t>
+            </w:r>
+            <w:proofErr w:type="spellStart"/>
+            <w:r>
+              <w:t>P</w:t>
+            </w:r>
+            <w:r>
+              <w:t>s</w:t>
+            </w:r>
+            <w:r>
+              <w:t>ycInfo</w:t>
+            </w:r>
+            <w:proofErr w:type="spellEnd"/>
+            <w:r>
+              <w:t xml:space="preserve"> Classification Code if available, and recorded it in a spreadsheet. </w:t>
+            </w:r>
+          </w:p>
+        </w:tc>
+      </w:tr>
+      <w:tr>
+        <w:tc>
+          <w:tcPr>
+            <w:tcW w:w="4514" w:type="dxa"/>
+            <w:tcMar>
+              <w:top w:w="100" w:type="dxa"/>
+              <w:left w:w="100" w:type="dxa"/>
+              <w:bottom w:w="100" w:type="dxa"/>
+              <w:right w:w="100" w:type="dxa"/>
+            </w:tcMar>
+          </w:tcPr>
+          <w:p>
+            <w:pPr>
+              <w:rPr>
+                <w:rFonts w:ascii="Open Sans" w:eastAsia="Open Sans" w:hAnsi="Open Sans" w:cs="Open Sans"/>
+                <w:b/>
+                <w:sz w:val="24"/>
+                <w:szCs w:val="24"/>
+              </w:rPr>
+            </w:pPr>
+            <w:r>
+              <w:rPr>
+                <w:rFonts w:ascii="Open Sans" w:eastAsia="Open Sans" w:hAnsi="Open Sans" w:cs="Open Sans"/>
+                <w:b/>
+                <w:sz w:val="24"/>
+                <w:szCs w:val="24"/>
+              </w:rPr>
+              <w:t xml:space="preserve">Are the data stored in a location that qualifies as a </w:t>
+            </w:r>
+            <w:hyperlink r:id="rId15">
+              <w:r>
+                <w:rPr>
+                  <w:rFonts w:ascii="Open Sans" w:eastAsia="Open Sans" w:hAnsi="Open Sans" w:cs="Open Sans"/>
+                  <w:b/>
+                  <w:color w:val="1155CC"/>
+                  <w:sz w:val="24"/>
+                  <w:szCs w:val="24"/>
+                </w:rPr>
+                <w:t>trusted repository</w:t>
+              </w:r>
+            </w:hyperlink>
+            <w:r>
+              <w:rPr>
+                <w:rFonts w:ascii="Open Sans" w:eastAsia="Open Sans" w:hAnsi="Open Sans" w:cs="Open Sans"/>
+                <w:b/>
+                <w:sz w:val="24"/>
+                <w:szCs w:val="24"/>
+              </w:rPr>
+              <w:t>?</w:t>
+            </w:r>
+          </w:p>
+        </w:tc>
+        <w:tc>
+          <w:tcPr>
+            <w:tcW w:w="4514" w:type="dxa"/>
+            <w:tcMar>
+              <w:top w:w="100" w:type="dxa"/>
+              <w:left w:w="100" w:type="dxa"/>
+              <w:bottom w:w="100" w:type="dxa"/>
+              <w:right w:w="100" w:type="dxa"/>
+            </w:tcMar>
+          </w:tcPr>
+          <w:p>
+            <w:pPr>
+              <w:widowControl w:val="0"/>
+              <w:pBdr>
+                <w:top w:val="nil"/>
+                <w:left w:val="nil"/>
+                <w:bottom w:val="nil"/>
+                <w:right w:val="nil"/>
+                <w:between w:val="nil"/>
+              </w:pBdr>
+              <w:spacing w:line="240" w:lineRule="auto"/>
+            </w:pPr>
+          </w:p>
+          <w:p>
+            <w:pPr>
+              <w:jc w:val="center"/>
+            </w:pPr>
+            <w:r>
+              <w:t>Yes</w:t>
+            </w:r>
+          </w:p>
+        </w:tc>
+      </w:tr>
+      <w:tr>
+        <w:tc>
+          <w:tcPr>
+            <w:tcW w:w="4514" w:type="dxa"/>
+            <w:tcMar>
+              <w:top w:w="100" w:type="dxa"/>
+              <w:left w:w="100" w:type="dxa"/>
+              <w:bottom w:w="100" w:type="dxa"/>
+              <w:right w:w="100" w:type="dxa"/>
+            </w:tcMar>
+          </w:tcPr>
+          <w:p>
+            <w:pPr>
+              <w:rPr>
+                <w:rFonts w:ascii="Open Sans" w:eastAsia="Open Sans" w:hAnsi="Open Sans" w:cs="Open Sans"/>
+                <w:b/>
+                <w:sz w:val="24"/>
+                <w:szCs w:val="24"/>
+              </w:rPr>
+            </w:pPr>
+            <w:r>
+              <w:rPr>
+                <w:rFonts w:ascii="Open Sans" w:eastAsia="Open Sans" w:hAnsi="Open Sans" w:cs="Open Sans"/>
+                <w:b/>
+                <w:sz w:val="24"/>
+                <w:szCs w:val="24"/>
+              </w:rPr>
+              <w:t>Please link to documentation that describes the data (e.g., data dictionary or codebook).</w:t>
+            </w:r>
+          </w:p>
+        </w:tc>
+        <w:tc>
+          <w:tcPr>
+            <w:tcW w:w="4514" w:type="dxa"/>
+            <w:tcMar>
+              <w:top w:w="100" w:type="dxa"/>
+              <w:left w:w="100" w:type="dxa"/>
+              <w:bottom w:w="100" w:type="dxa"/>
+              <w:right w:w="100" w:type="dxa"/>
+            </w:tcMar>
+          </w:tcPr>
+          <w:p>
+            <w:pPr>
+              <w:widowControl w:val="0"/>
+              <w:pBdr>
+                <w:top w:val="nil"/>
+                <w:left w:val="nil"/>
+                <w:bottom w:val="nil"/>
+                <w:right w:val="nil"/>
+                <w:between w:val="nil"/>
+              </w:pBdr>
+              <w:spacing w:line="240" w:lineRule="auto"/>
+            </w:pPr>
+            <w:r>
+              <w:t>https://www.apa.org/pubs/databases/training/class-codes</w:t>
+            </w:r>
+          </w:p>
+        </w:tc>
+      </w:tr>
+      <w:tr>
+        <w:tc>
+          <w:tcPr>
+            <w:tcW w:w="4514" w:type="dxa"/>
+            <w:tcMar>
+              <w:top w:w="100" w:type="dxa"/>
+              <w:left w:w="100" w:type="dxa"/>
+              <w:bottom w:w="100" w:type="dxa"/>
+              <w:right w:w="100" w:type="dxa"/>
+            </w:tcMar>
+          </w:tcPr>
+          <w:p>
+            <w:pPr>
+              <w:rPr>
+                <w:rFonts w:ascii="Open Sans" w:eastAsia="Open Sans" w:hAnsi="Open Sans" w:cs="Open Sans"/>
+                <w:b/>
+                <w:sz w:val="24"/>
+                <w:szCs w:val="24"/>
+              </w:rPr>
+            </w:pPr>
+            <w:r>
+              <w:rPr>
+                <w:rFonts w:ascii="Open Sans" w:eastAsia="Open Sans" w:hAnsi="Open Sans" w:cs="Open Sans"/>
+                <w:b/>
+                <w:sz w:val="24"/>
+                <w:szCs w:val="24"/>
+              </w:rPr>
+              <w:t>If there are materials relevant to acquisition of this data (e.g., survey instruments) please link to them. Please also link to documentation that describes the materials.</w:t>
+            </w:r>
+          </w:p>
+        </w:tc>
+        <w:tc>
+          <w:tcPr>
+            <w:tcW w:w="4514" w:type="dxa"/>
+            <w:tcMar>
+              <w:top w:w="100" w:type="dxa"/>
+              <w:left w:w="100" w:type="dxa"/>
+              <w:bottom w:w="100" w:type="dxa"/>
+              <w:right w:w="100" w:type="dxa"/>
+            </w:tcMar>
+          </w:tcPr>
+          <w:p>
+            <w:pPr>
+              <w:widowControl w:val="0"/>
+              <w:pBdr>
+                <w:top w:val="nil"/>
+                <w:left w:val="nil"/>
+                <w:bottom w:val="nil"/>
+                <w:right w:val="nil"/>
+                <w:between w:val="nil"/>
+              </w:pBdr>
+              <w:spacing w:line="240" w:lineRule="auto"/>
+            </w:pPr>
+            <w:r>
+              <w:t>N/A</w:t>
+            </w:r>
+          </w:p>
+        </w:tc>
+      </w:tr>
+      <w:tr>
+        <w:tc>
+          <w:tcPr>
+            <w:tcW w:w="4514" w:type="dxa"/>
+            <w:tcMar>
+              <w:top w:w="100" w:type="dxa"/>
+              <w:left w:w="100" w:type="dxa"/>
+              <w:bottom w:w="100" w:type="dxa"/>
+              <w:right w:w="100" w:type="dxa"/>
+            </w:tcMar>
+          </w:tcPr>
+          <w:p>
+            <w:pPr>
+              <w:rPr>
+                <w:rFonts w:ascii="Open Sans" w:eastAsia="Open Sans" w:hAnsi="Open Sans" w:cs="Open Sans"/>
+                <w:b/>
+                <w:sz w:val="24"/>
+                <w:szCs w:val="24"/>
+              </w:rPr>
+            </w:pPr>
+            <w:r>
+              <w:rPr>
+                <w:rFonts w:ascii="Open Sans" w:eastAsia="Open Sans" w:hAnsi="Open Sans" w:cs="Open Sans"/>
+                <w:b/>
+                <w:sz w:val="24"/>
+                <w:szCs w:val="24"/>
+              </w:rPr>
+              <w:t>Other information about these data.</w:t>
+            </w:r>
+          </w:p>
+        </w:tc>
+        <w:tc>
+          <w:tcPr>
+            <w:tcW w:w="4514" w:type="dxa"/>
+            <w:tcMar>
+              <w:top w:w="100" w:type="dxa"/>
+              <w:left w:w="100" w:type="dxa"/>
+              <w:bottom w:w="100" w:type="dxa"/>
+              <w:right w:w="100" w:type="dxa"/>
+            </w:tcMar>
+          </w:tcPr>
+          <w:p>
+            <w:pPr>
+              <w:widowControl w:val="0"/>
+              <w:pBdr>
+                <w:top w:val="nil"/>
+                <w:left w:val="nil"/>
+                <w:bottom w:val="nil"/>
+                <w:right w:val="nil"/>
+                <w:between w:val="nil"/>
+              </w:pBdr>
+              <w:spacing w:line="240" w:lineRule="auto"/>
+            </w:pPr>
+            <w:r>
+              <w:t>N/A</w:t>
+            </w:r>
+          </w:p>
+        </w:tc>
+      </w:tr>
     </w:tbl>
     <w:p/>
     <w:p>
@@ -1439,8 +3542,6 @@
       <w:pPr>
         <w:rPr>
           <w:rFonts w:ascii="Open Sans" w:eastAsia="Open Sans" w:hAnsi="Open Sans" w:cs="Open Sans"/>
-          <w:sz w:val="24"/>
-          <w:szCs w:val="24"/>
         </w:rPr>
       </w:pPr>
     </w:p>
@@ -1452,6 +3553,15 @@
           <w:szCs w:val="24"/>
         </w:rPr>
       </w:pPr>
+    </w:p>
+    <w:p>
+      <w:pPr>
+        <w:rPr>
+          <w:rFonts w:ascii="Open Sans" w:eastAsia="Open Sans" w:hAnsi="Open Sans" w:cs="Open Sans"/>
+          <w:sz w:val="24"/>
+          <w:szCs w:val="24"/>
+        </w:rPr>
+      </w:pPr>
       <w:r>
         <w:rPr>
           <w:rFonts w:ascii="Open Sans" w:eastAsia="Open Sans" w:hAnsi="Open Sans" w:cs="Open Sans"/>
@@ -1459,7 +3569,25 @@
           <w:sz w:val="24"/>
           <w:szCs w:val="24"/>
         </w:rPr>
-        <w:t xml:space="preserve">Table 2. </w:t>
+        <w:t xml:space="preserve">Table </w:t>
+      </w:r>
+      <w:r>
+        <w:rPr>
+          <w:rFonts w:ascii="Open Sans" w:eastAsia="Open Sans" w:hAnsi="Open Sans" w:cs="Open Sans"/>
+          <w:b/>
+          <w:sz w:val="24"/>
+          <w:szCs w:val="24"/>
+        </w:rPr>
+        <w:t>4</w:t>
+      </w:r>
+      <w:r>
+        <w:rPr>
+          <w:rFonts w:ascii="Open Sans" w:eastAsia="Open Sans" w:hAnsi="Open Sans" w:cs="Open Sans"/>
+          <w:b/>
+          <w:sz w:val="24"/>
+          <w:szCs w:val="24"/>
+        </w:rPr>
+        <w:t xml:space="preserve">. </w:t>
       </w:r>
       <w:r>
         <w:rPr>
@@ -1668,7 +3796,6 @@
                 <w:sz w:val="24"/>
                 <w:szCs w:val="24"/>
               </w:rPr>
-              <w:lastRenderedPageBreak/>
               <w:t>If relevant, provide a citation to the materials here and in the manuscript.</w:t>
             </w:r>
           </w:p>
@@ -1790,6 +3917,7 @@
                 <w:sz w:val="24"/>
                 <w:szCs w:val="24"/>
               </w:rPr>
+              <w:lastRenderedPageBreak/>
               <w:t>materials are not available</w:t>
             </w:r>
           </w:p>
@@ -1833,6 +3961,7 @@
               <w:spacing w:line="240" w:lineRule="auto"/>
             </w:pPr>
             <w:r>
+              <w:lastRenderedPageBreak/>
               <w:t>N/A</w:t>
             </w:r>
           </w:p>
@@ -1988,7 +4117,7 @@
               </w:rPr>
               <w:t xml:space="preserve">Are the materials stored in a location that qualifies as a </w:t>
             </w:r>
-            <w:hyperlink r:id="rId11">
+            <w:hyperlink r:id="rId16">
               <w:r>
                 <w:rPr>
                   <w:rFonts w:ascii="Open Sans" w:eastAsia="Open Sans" w:hAnsi="Open Sans" w:cs="Open Sans"/>
@@ -2946,7 +5075,6 @@
   <w:style w:type="character" w:default="1" w:styleId="DefaultParagraphFont">
     <w:name w:val="Default Paragraph Font"/>
     <w:uiPriority w:val="1"/>
-    <w:semiHidden/>
     <w:unhideWhenUsed/>
   </w:style>
   <w:style w:type="table" w:default="1" w:styleId="TableNormal">

</xml_diff>

<commit_message>
Minor updates to transparency doc
</commit_message>
<xml_diff>
--- a/admin/btpsych24a_DataTransparencyGuidelines.docx
+++ b/admin/btpsych24a_DataTransparencyGuidelines.docx
@@ -398,25 +398,7 @@
           <w:sz w:val="24"/>
           <w:szCs w:val="24"/>
         </w:rPr>
-        <w:t xml:space="preserve">Table </w:t>
-      </w:r>
-      <w:r>
-        <w:rPr>
-          <w:rFonts w:ascii="Open Sans" w:eastAsia="Open Sans" w:hAnsi="Open Sans" w:cs="Open Sans"/>
-          <w:b/>
-          <w:sz w:val="24"/>
-          <w:szCs w:val="24"/>
-        </w:rPr>
-        <w:t>1</w:t>
-      </w:r>
-      <w:r>
-        <w:rPr>
-          <w:rFonts w:ascii="Open Sans" w:eastAsia="Open Sans" w:hAnsi="Open Sans" w:cs="Open Sans"/>
-          <w:b/>
-          <w:sz w:val="24"/>
-          <w:szCs w:val="24"/>
-        </w:rPr>
-        <w:t xml:space="preserve">. </w:t>
+        <w:t xml:space="preserve">Table 1. </w:t>
       </w:r>
       <w:r>
         <w:rPr>
@@ -554,18 +536,17 @@
               </w:pBdr>
               <w:spacing w:line="240" w:lineRule="auto"/>
             </w:pPr>
-            <w:r>
-              <w:t>OpenAlex/</w:t>
-            </w:r>
             <w:proofErr w:type="spellStart"/>
             <w:r>
-              <w:t>OurRes</w:t>
-            </w:r>
-            <w:r>
-              <w:t>e</w:t>
-            </w:r>
-            <w:r>
-              <w:t>arch</w:t>
+              <w:t>OpenAlex</w:t>
+            </w:r>
+            <w:proofErr w:type="spellEnd"/>
+            <w:r>
+              <w:t>/</w:t>
+            </w:r>
+            <w:proofErr w:type="spellStart"/>
+            <w:r>
+              <w:t>OurResearch</w:t>
             </w:r>
             <w:proofErr w:type="spellEnd"/>
           </w:p>
@@ -2494,25 +2475,7 @@
           <w:sz w:val="24"/>
           <w:szCs w:val="24"/>
         </w:rPr>
-        <w:t xml:space="preserve">Table </w:t>
-      </w:r>
-      <w:r>
-        <w:rPr>
-          <w:rFonts w:ascii="Open Sans" w:eastAsia="Open Sans" w:hAnsi="Open Sans" w:cs="Open Sans"/>
-          <w:b/>
-          <w:sz w:val="24"/>
-          <w:szCs w:val="24"/>
-        </w:rPr>
-        <w:t>3</w:t>
-      </w:r>
-      <w:r>
-        <w:rPr>
-          <w:rFonts w:ascii="Open Sans" w:eastAsia="Open Sans" w:hAnsi="Open Sans" w:cs="Open Sans"/>
-          <w:b/>
-          <w:sz w:val="24"/>
-          <w:szCs w:val="24"/>
-        </w:rPr>
-        <w:t xml:space="preserve">. </w:t>
+        <w:t xml:space="preserve">Table 3. </w:t>
       </w:r>
       <w:r>
         <w:rPr>
@@ -2621,10 +2584,7 @@
             </w:r>
             <w:proofErr w:type="spellEnd"/>
             <w:r>
-              <w:t xml:space="preserve"> data</w:t>
-            </w:r>
-            <w:r>
-              <w:t>base</w:t>
+              <w:t xml:space="preserve"> database</w:t>
             </w:r>
           </w:p>
         </w:tc>
@@ -2745,13 +2705,7 @@
               <w:rPr>
                 <w:lang w:val="en-US"/>
               </w:rPr>
-              <w:t>Nicholas A. Coles</w:t>
-            </w:r>
-            <w:r>
-              <w:rPr>
-                <w:lang w:val="en-US"/>
-              </w:rPr>
-              <w:t>, Joao Takayanagi, Gabrielle</w:t>
+              <w:t>Nicholas A. Coles, Joao Takayanagi, Gabrielle</w:t>
             </w:r>
             <w:r>
               <w:rPr>
@@ -2990,7 +2944,7 @@
               <w:spacing w:line="240" w:lineRule="auto"/>
             </w:pPr>
             <w:r>
-              <w:t>Restricted</w:t>
+              <w:t>Public</w:t>
             </w:r>
           </w:p>
         </w:tc>
@@ -3066,29 +3020,52 @@
               <w:spacing w:line="240" w:lineRule="auto"/>
             </w:pPr>
             <w:r>
-              <w:t xml:space="preserve">To access the </w:t>
-            </w:r>
-            <w:proofErr w:type="spellStart"/>
-            <w:r>
-              <w:t>PsycInfo</w:t>
-            </w:r>
-            <w:proofErr w:type="spellEnd"/>
-            <w:r>
-              <w:t xml:space="preserve"> database, users require a license. However, a</w:t>
-            </w:r>
-            <w:r>
-              <w:t xml:space="preserve">uthorized </w:t>
-            </w:r>
-            <w:r>
-              <w:t>u</w:t>
-            </w:r>
-            <w:r>
-              <w:t>sers may extract or use a reasonable amount of information contained in the database for educational, scientific, or research purposes, including extraction and manipulation of information for the purpose of illustration, explanation, example, comment, criticism, teaching, research, or analysis.</w:t>
-            </w:r>
-            <w:r>
-              <w:t xml:space="preserve"> </w:t>
-            </w:r>
-          </w:p>
+              <w:t>N/A</w:t>
+            </w:r>
+          </w:p>
+        </w:tc>
+      </w:tr>
+      <w:tr>
+        <w:tc>
+          <w:tcPr>
+            <w:tcW w:w="4514" w:type="dxa"/>
+            <w:tcMar>
+              <w:top w:w="100" w:type="dxa"/>
+              <w:left w:w="100" w:type="dxa"/>
+              <w:bottom w:w="100" w:type="dxa"/>
+              <w:right w:w="100" w:type="dxa"/>
+            </w:tcMar>
+          </w:tcPr>
+          <w:p>
+            <w:pPr>
+              <w:rPr>
+                <w:rFonts w:ascii="Open Sans" w:eastAsia="Open Sans" w:hAnsi="Open Sans" w:cs="Open Sans"/>
+                <w:b/>
+                <w:sz w:val="24"/>
+                <w:szCs w:val="24"/>
+              </w:rPr>
+            </w:pPr>
+            <w:r>
+              <w:rPr>
+                <w:rFonts w:ascii="Open Sans" w:eastAsia="Open Sans" w:hAnsi="Open Sans" w:cs="Open Sans"/>
+                <w:b/>
+                <w:sz w:val="24"/>
+                <w:szCs w:val="24"/>
+              </w:rPr>
+              <w:t>Provide clear step-by-step instructions explaining how the data were obtained / how an independent researcher could access the data. Ensure that you provide sufficient detail about accessing the *specific data used in the present study*.</w:t>
+            </w:r>
+          </w:p>
+        </w:tc>
+        <w:tc>
+          <w:tcPr>
+            <w:tcW w:w="4514" w:type="dxa"/>
+            <w:tcMar>
+              <w:top w:w="100" w:type="dxa"/>
+              <w:left w:w="100" w:type="dxa"/>
+              <w:bottom w:w="100" w:type="dxa"/>
+              <w:right w:w="100" w:type="dxa"/>
+            </w:tcMar>
+          </w:tcPr>
           <w:p>
             <w:pPr>
               <w:widowControl w:val="0"/>
@@ -3101,21 +3078,72 @@
               </w:pBdr>
               <w:spacing w:line="240" w:lineRule="auto"/>
             </w:pPr>
-          </w:p>
-          <w:p>
-            <w:pPr>
-              <w:widowControl w:val="0"/>
-              <w:pBdr>
-                <w:top w:val="nil"/>
-                <w:left w:val="nil"/>
-                <w:bottom w:val="nil"/>
-                <w:right w:val="nil"/>
-                <w:between w:val="nil"/>
-              </w:pBdr>
-              <w:spacing w:line="240" w:lineRule="auto"/>
-            </w:pPr>
-            <w:r>
-              <w:t>https://www.apa.org/pubs/librarians/licenses/terms-and-conditions</w:t>
+            <w:r>
+              <w:t xml:space="preserve">First, we categorized the filtered OpenAlex data in bins according to the number of authors </w:t>
+            </w:r>
+            <w:r>
+              <w:t>in</w:t>
+            </w:r>
+            <w:r>
+              <w:t xml:space="preserve"> the paper (1-4 authors, 5-9 authors, 10-19 authors, 20-29 authors, 30-39 authors, and so on). Next, we randomly sampled 300 papers from each bin and </w:t>
+            </w:r>
+            <w:r>
+              <w:t>created a list of</w:t>
+            </w:r>
+            <w:r>
+              <w:t xml:space="preserve"> the</w:t>
+            </w:r>
+            <w:r>
+              <w:t>ir</w:t>
+            </w:r>
+            <w:r>
+              <w:t xml:space="preserve"> DOI</w:t>
+            </w:r>
+            <w:r>
+              <w:t>s</w:t>
+            </w:r>
+            <w:r>
+              <w:t xml:space="preserve">. Finally, we manually entered </w:t>
+            </w:r>
+            <w:r>
+              <w:t>each</w:t>
+            </w:r>
+            <w:r>
+              <w:t xml:space="preserve"> DOI in the </w:t>
+            </w:r>
+            <w:proofErr w:type="spellStart"/>
+            <w:r>
+              <w:t>PsycInfo</w:t>
+            </w:r>
+            <w:proofErr w:type="spellEnd"/>
+            <w:r>
+              <w:t xml:space="preserve"> database</w:t>
+            </w:r>
+            <w:r>
+              <w:t xml:space="preserve"> search tool</w:t>
+            </w:r>
+            <w:r>
+              <w:t xml:space="preserve">, </w:t>
+            </w:r>
+            <w:r>
+              <w:t>extracted</w:t>
+            </w:r>
+            <w:r>
+              <w:t xml:space="preserve"> the APA </w:t>
+            </w:r>
+            <w:proofErr w:type="spellStart"/>
+            <w:r>
+              <w:t>P</w:t>
+            </w:r>
+            <w:r>
+              <w:t>s</w:t>
+            </w:r>
+            <w:r>
+              <w:t>ycInfo</w:t>
+            </w:r>
+            <w:proofErr w:type="spellEnd"/>
+            <w:r>
+              <w:t xml:space="preserve"> Classification Code if available, and recorded it in a spreadsheet. </w:t>
             </w:r>
           </w:p>
         </w:tc>
@@ -3147,140 +3175,7 @@
                 <w:sz w:val="24"/>
                 <w:szCs w:val="24"/>
               </w:rPr>
-              <w:t xml:space="preserve">Provide clear step-by-step instructions explaining how the data were obtained / how an independent researcher could access the data. Ensure that you provide sufficient detail about </w:t>
-            </w:r>
-            <w:r>
-              <w:rPr>
-                <w:rFonts w:ascii="Open Sans" w:eastAsia="Open Sans" w:hAnsi="Open Sans" w:cs="Open Sans"/>
-                <w:b/>
-                <w:sz w:val="24"/>
-                <w:szCs w:val="24"/>
-              </w:rPr>
               <w:lastRenderedPageBreak/>
-              <w:t>accessing the *specific data used in the present study*.</w:t>
-            </w:r>
-          </w:p>
-        </w:tc>
-        <w:tc>
-          <w:tcPr>
-            <w:tcW w:w="4514" w:type="dxa"/>
-            <w:tcMar>
-              <w:top w:w="100" w:type="dxa"/>
-              <w:left w:w="100" w:type="dxa"/>
-              <w:bottom w:w="100" w:type="dxa"/>
-              <w:right w:w="100" w:type="dxa"/>
-            </w:tcMar>
-          </w:tcPr>
-          <w:p>
-            <w:pPr>
-              <w:widowControl w:val="0"/>
-              <w:pBdr>
-                <w:top w:val="nil"/>
-                <w:left w:val="nil"/>
-                <w:bottom w:val="nil"/>
-                <w:right w:val="nil"/>
-                <w:between w:val="nil"/>
-              </w:pBdr>
-              <w:spacing w:line="240" w:lineRule="auto"/>
-            </w:pPr>
-            <w:r>
-              <w:lastRenderedPageBreak/>
-              <w:t xml:space="preserve">First, we categorized the filtered OpenAlex data in bins according to the number of authors </w:t>
-            </w:r>
-            <w:r>
-              <w:t>in</w:t>
-            </w:r>
-            <w:r>
-              <w:t xml:space="preserve"> the paper (1-4 authors, 5-9 authors, 10-19 authors, 20-29 authors, 30-39 authors, and so on). Next, we randomly sampled 300 papers from each bin and </w:t>
-            </w:r>
-            <w:r>
-              <w:t>created a list of</w:t>
-            </w:r>
-            <w:r>
-              <w:t xml:space="preserve"> the</w:t>
-            </w:r>
-            <w:r>
-              <w:t>ir</w:t>
-            </w:r>
-            <w:r>
-              <w:t xml:space="preserve"> DOI</w:t>
-            </w:r>
-            <w:r>
-              <w:t>s</w:t>
-            </w:r>
-            <w:r>
-              <w:t xml:space="preserve">. Finally, we manually entered </w:t>
-            </w:r>
-            <w:r>
-              <w:t>each</w:t>
-            </w:r>
-            <w:r>
-              <w:t xml:space="preserve"> DOI in the </w:t>
-            </w:r>
-            <w:proofErr w:type="spellStart"/>
-            <w:r>
-              <w:t>PsycInfo</w:t>
-            </w:r>
-            <w:proofErr w:type="spellEnd"/>
-            <w:r>
-              <w:t xml:space="preserve"> database</w:t>
-            </w:r>
-            <w:r>
-              <w:t xml:space="preserve"> search tool</w:t>
-            </w:r>
-            <w:r>
-              <w:t xml:space="preserve">, </w:t>
-            </w:r>
-            <w:r>
-              <w:t>extracted</w:t>
-            </w:r>
-            <w:r>
-              <w:t xml:space="preserve"> the APA </w:t>
-            </w:r>
-            <w:proofErr w:type="spellStart"/>
-            <w:r>
-              <w:t>P</w:t>
-            </w:r>
-            <w:r>
-              <w:t>s</w:t>
-            </w:r>
-            <w:r>
-              <w:t>ycInfo</w:t>
-            </w:r>
-            <w:proofErr w:type="spellEnd"/>
-            <w:r>
-              <w:t xml:space="preserve"> Classification Code if available, and recorded it in a spreadsheet. </w:t>
-            </w:r>
-          </w:p>
-        </w:tc>
-      </w:tr>
-      <w:tr>
-        <w:tc>
-          <w:tcPr>
-            <w:tcW w:w="4514" w:type="dxa"/>
-            <w:tcMar>
-              <w:top w:w="100" w:type="dxa"/>
-              <w:left w:w="100" w:type="dxa"/>
-              <w:bottom w:w="100" w:type="dxa"/>
-              <w:right w:w="100" w:type="dxa"/>
-            </w:tcMar>
-          </w:tcPr>
-          <w:p>
-            <w:pPr>
-              <w:rPr>
-                <w:rFonts w:ascii="Open Sans" w:eastAsia="Open Sans" w:hAnsi="Open Sans" w:cs="Open Sans"/>
-                <w:b/>
-                <w:sz w:val="24"/>
-                <w:szCs w:val="24"/>
-              </w:rPr>
-            </w:pPr>
-            <w:r>
-              <w:rPr>
-                <w:rFonts w:ascii="Open Sans" w:eastAsia="Open Sans" w:hAnsi="Open Sans" w:cs="Open Sans"/>
-                <w:b/>
-                <w:sz w:val="24"/>
-                <w:szCs w:val="24"/>
-              </w:rPr>
               <w:t xml:space="preserve">Are the data stored in a location that qualifies as a </w:t>
             </w:r>
             <w:hyperlink r:id="rId15">
@@ -3508,755 +3403,6 @@
                 <w:right w:val="nil"/>
                 <w:between w:val="nil"/>
               </w:pBdr>
-              <w:spacing w:line="240" w:lineRule="auto"/>
-            </w:pPr>
-            <w:r>
-              <w:t>N/A</w:t>
-            </w:r>
-          </w:p>
-        </w:tc>
-      </w:tr>
-    </w:tbl>
-    <w:p/>
-    <w:p>
-      <w:pPr>
-        <w:rPr>
-          <w:rFonts w:ascii="Open Sans" w:eastAsia="Open Sans" w:hAnsi="Open Sans" w:cs="Open Sans"/>
-        </w:rPr>
-      </w:pPr>
-      <w:r>
-        <w:rPr>
-          <w:rFonts w:ascii="Open Sans" w:eastAsia="Open Sans" w:hAnsi="Open Sans" w:cs="Open Sans"/>
-        </w:rPr>
-        <w:t>*Ideally link to publicly available documentation. Private documentation can be shared with the journal’s STAR Team (</w:t>
-      </w:r>
-      <w:r>
-        <w:rPr>
-          <w:rFonts w:ascii="Open Sans" w:eastAsia="Open Sans" w:hAnsi="Open Sans" w:cs="Open Sans"/>
-          <w:color w:val="1F1F1F"/>
-        </w:rPr>
-        <w:t>psych.star.team@gmail.com).</w:t>
-      </w:r>
-    </w:p>
-    <w:p>
-      <w:pPr>
-        <w:rPr>
-          <w:rFonts w:ascii="Open Sans" w:eastAsia="Open Sans" w:hAnsi="Open Sans" w:cs="Open Sans"/>
-        </w:rPr>
-      </w:pPr>
-    </w:p>
-    <w:p>
-      <w:pPr>
-        <w:rPr>
-          <w:rFonts w:ascii="Open Sans" w:eastAsia="Open Sans" w:hAnsi="Open Sans" w:cs="Open Sans"/>
-          <w:sz w:val="24"/>
-          <w:szCs w:val="24"/>
-        </w:rPr>
-      </w:pPr>
-    </w:p>
-    <w:p>
-      <w:pPr>
-        <w:rPr>
-          <w:rFonts w:ascii="Open Sans" w:eastAsia="Open Sans" w:hAnsi="Open Sans" w:cs="Open Sans"/>
-          <w:sz w:val="24"/>
-          <w:szCs w:val="24"/>
-        </w:rPr>
-      </w:pPr>
-      <w:r>
-        <w:rPr>
-          <w:rFonts w:ascii="Open Sans" w:eastAsia="Open Sans" w:hAnsi="Open Sans" w:cs="Open Sans"/>
-          <w:b/>
-          <w:sz w:val="24"/>
-          <w:szCs w:val="24"/>
-        </w:rPr>
-        <w:t xml:space="preserve">Table </w:t>
-      </w:r>
-      <w:r>
-        <w:rPr>
-          <w:rFonts w:ascii="Open Sans" w:eastAsia="Open Sans" w:hAnsi="Open Sans" w:cs="Open Sans"/>
-          <w:b/>
-          <w:sz w:val="24"/>
-          <w:szCs w:val="24"/>
-        </w:rPr>
-        <w:t>4</w:t>
-      </w:r>
-      <w:r>
-        <w:rPr>
-          <w:rFonts w:ascii="Open Sans" w:eastAsia="Open Sans" w:hAnsi="Open Sans" w:cs="Open Sans"/>
-          <w:b/>
-          <w:sz w:val="24"/>
-          <w:szCs w:val="24"/>
-        </w:rPr>
-        <w:t xml:space="preserve">. </w:t>
-      </w:r>
-      <w:r>
-        <w:rPr>
-          <w:rFonts w:ascii="Open Sans" w:eastAsia="Open Sans" w:hAnsi="Open Sans" w:cs="Open Sans"/>
-          <w:sz w:val="24"/>
-          <w:szCs w:val="24"/>
-        </w:rPr>
-        <w:t>Transparency form for third-party materials.</w:t>
-      </w:r>
-    </w:p>
-    <w:p/>
-    <w:tbl>
-      <w:tblPr>
-        <w:tblStyle w:val="a1"/>
-        <w:tblW w:w="9029" w:type="dxa"/>
-        <w:tblInd w:w="0" w:type="dxa"/>
-        <w:tblBorders>
-          <w:top w:val="single" w:sz="8" w:space="0" w:color="000000"/>
-          <w:left w:val="single" w:sz="8" w:space="0" w:color="000000"/>
-          <w:bottom w:val="single" w:sz="8" w:space="0" w:color="000000"/>
-          <w:right w:val="single" w:sz="8" w:space="0" w:color="000000"/>
-          <w:insideH w:val="single" w:sz="8" w:space="0" w:color="000000"/>
-          <w:insideV w:val="single" w:sz="8" w:space="0" w:color="000000"/>
-        </w:tblBorders>
-        <w:tblLayout w:type="fixed"/>
-        <w:tblLook w:val="0600" w:firstRow="0" w:lastRow="0" w:firstColumn="0" w:lastColumn="0" w:noHBand="1" w:noVBand="1"/>
-      </w:tblPr>
-      <w:tblGrid>
-        <w:gridCol w:w="4514"/>
-        <w:gridCol w:w="4515"/>
-      </w:tblGrid>
-      <w:tr>
-        <w:tc>
-          <w:tcPr>
-            <w:tcW w:w="4514" w:type="dxa"/>
-            <w:tcMar>
-              <w:top w:w="100" w:type="dxa"/>
-              <w:left w:w="100" w:type="dxa"/>
-              <w:bottom w:w="100" w:type="dxa"/>
-              <w:right w:w="100" w:type="dxa"/>
-            </w:tcMar>
-          </w:tcPr>
-          <w:p>
-            <w:pPr>
-              <w:rPr>
-                <w:b/>
-              </w:rPr>
-            </w:pPr>
-            <w:r>
-              <w:rPr>
-                <w:rFonts w:ascii="Open Sans" w:eastAsia="Open Sans" w:hAnsi="Open Sans" w:cs="Open Sans"/>
-                <w:b/>
-                <w:sz w:val="24"/>
-                <w:szCs w:val="24"/>
-              </w:rPr>
-              <w:t>Name and/or source of materials</w:t>
-            </w:r>
-          </w:p>
-        </w:tc>
-        <w:tc>
-          <w:tcPr>
-            <w:tcW w:w="4514" w:type="dxa"/>
-            <w:tcMar>
-              <w:top w:w="100" w:type="dxa"/>
-              <w:left w:w="100" w:type="dxa"/>
-              <w:bottom w:w="100" w:type="dxa"/>
-              <w:right w:w="100" w:type="dxa"/>
-            </w:tcMar>
-          </w:tcPr>
-          <w:p>
-            <w:pPr>
-              <w:widowControl w:val="0"/>
-              <w:spacing w:line="240" w:lineRule="auto"/>
-            </w:pPr>
-            <w:r>
-              <w:t>N/A</w:t>
-            </w:r>
-          </w:p>
-        </w:tc>
-      </w:tr>
-      <w:tr>
-        <w:tc>
-          <w:tcPr>
-            <w:tcW w:w="4514" w:type="dxa"/>
-            <w:tcMar>
-              <w:top w:w="100" w:type="dxa"/>
-              <w:left w:w="100" w:type="dxa"/>
-              <w:bottom w:w="100" w:type="dxa"/>
-              <w:right w:w="100" w:type="dxa"/>
-            </w:tcMar>
-          </w:tcPr>
-          <w:p>
-            <w:pPr>
-              <w:rPr>
-                <w:b/>
-              </w:rPr>
-            </w:pPr>
-            <w:r>
-              <w:rPr>
-                <w:rFonts w:ascii="Open Sans" w:eastAsia="Open Sans" w:hAnsi="Open Sans" w:cs="Open Sans"/>
-                <w:b/>
-                <w:sz w:val="24"/>
-                <w:szCs w:val="24"/>
-              </w:rPr>
-              <w:t>Name of individual(s) / organisation that controls the materials</w:t>
-            </w:r>
-          </w:p>
-        </w:tc>
-        <w:tc>
-          <w:tcPr>
-            <w:tcW w:w="4514" w:type="dxa"/>
-            <w:tcMar>
-              <w:top w:w="100" w:type="dxa"/>
-              <w:left w:w="100" w:type="dxa"/>
-              <w:bottom w:w="100" w:type="dxa"/>
-              <w:right w:w="100" w:type="dxa"/>
-            </w:tcMar>
-          </w:tcPr>
-          <w:p>
-            <w:pPr>
-              <w:widowControl w:val="0"/>
-              <w:spacing w:line="240" w:lineRule="auto"/>
-            </w:pPr>
-            <w:r>
-              <w:t>N/A</w:t>
-            </w:r>
-          </w:p>
-        </w:tc>
-      </w:tr>
-      <w:tr>
-        <w:tc>
-          <w:tcPr>
-            <w:tcW w:w="4514" w:type="dxa"/>
-            <w:tcMar>
-              <w:top w:w="100" w:type="dxa"/>
-              <w:left w:w="100" w:type="dxa"/>
-              <w:bottom w:w="100" w:type="dxa"/>
-              <w:right w:w="100" w:type="dxa"/>
-            </w:tcMar>
-          </w:tcPr>
-          <w:p>
-            <w:pPr>
-              <w:rPr>
-                <w:rFonts w:ascii="Open Sans" w:eastAsia="Open Sans" w:hAnsi="Open Sans" w:cs="Open Sans"/>
-                <w:b/>
-                <w:sz w:val="24"/>
-                <w:szCs w:val="24"/>
-              </w:rPr>
-            </w:pPr>
-            <w:r>
-              <w:rPr>
-                <w:rFonts w:ascii="Open Sans" w:eastAsia="Open Sans" w:hAnsi="Open Sans" w:cs="Open Sans"/>
-                <w:b/>
-                <w:sz w:val="24"/>
-                <w:szCs w:val="24"/>
-              </w:rPr>
-              <w:t>Name of author(s) who obtained the materials from the third party</w:t>
-            </w:r>
-          </w:p>
-        </w:tc>
-        <w:tc>
-          <w:tcPr>
-            <w:tcW w:w="4514" w:type="dxa"/>
-            <w:tcMar>
-              <w:top w:w="100" w:type="dxa"/>
-              <w:left w:w="100" w:type="dxa"/>
-              <w:bottom w:w="100" w:type="dxa"/>
-              <w:right w:w="100" w:type="dxa"/>
-            </w:tcMar>
-          </w:tcPr>
-          <w:p>
-            <w:pPr>
-              <w:widowControl w:val="0"/>
-              <w:spacing w:line="240" w:lineRule="auto"/>
-            </w:pPr>
-            <w:r>
-              <w:t>N/A</w:t>
-            </w:r>
-          </w:p>
-        </w:tc>
-      </w:tr>
-      <w:tr>
-        <w:tc>
-          <w:tcPr>
-            <w:tcW w:w="4514" w:type="dxa"/>
-            <w:tcMar>
-              <w:top w:w="100" w:type="dxa"/>
-              <w:left w:w="100" w:type="dxa"/>
-              <w:bottom w:w="100" w:type="dxa"/>
-              <w:right w:w="100" w:type="dxa"/>
-            </w:tcMar>
-          </w:tcPr>
-          <w:p>
-            <w:pPr>
-              <w:rPr>
-                <w:rFonts w:ascii="Open Sans" w:eastAsia="Open Sans" w:hAnsi="Open Sans" w:cs="Open Sans"/>
-                <w:b/>
-                <w:sz w:val="24"/>
-                <w:szCs w:val="24"/>
-              </w:rPr>
-            </w:pPr>
-            <w:r>
-              <w:rPr>
-                <w:rFonts w:ascii="Open Sans" w:eastAsia="Open Sans" w:hAnsi="Open Sans" w:cs="Open Sans"/>
-                <w:b/>
-                <w:sz w:val="24"/>
-                <w:szCs w:val="24"/>
-              </w:rPr>
-              <w:t>If relevant, provide a citation to the materials here and in the manuscript.</w:t>
-            </w:r>
-          </w:p>
-        </w:tc>
-        <w:tc>
-          <w:tcPr>
-            <w:tcW w:w="4514" w:type="dxa"/>
-            <w:tcMar>
-              <w:top w:w="100" w:type="dxa"/>
-              <w:left w:w="100" w:type="dxa"/>
-              <w:bottom w:w="100" w:type="dxa"/>
-              <w:right w:w="100" w:type="dxa"/>
-            </w:tcMar>
-          </w:tcPr>
-          <w:p>
-            <w:pPr>
-              <w:widowControl w:val="0"/>
-              <w:spacing w:line="240" w:lineRule="auto"/>
-            </w:pPr>
-            <w:r>
-              <w:t>N/A</w:t>
-            </w:r>
-          </w:p>
-        </w:tc>
-      </w:tr>
-      <w:tr>
-        <w:tc>
-          <w:tcPr>
-            <w:tcW w:w="4514" w:type="dxa"/>
-            <w:tcMar>
-              <w:top w:w="100" w:type="dxa"/>
-              <w:left w:w="100" w:type="dxa"/>
-              <w:bottom w:w="100" w:type="dxa"/>
-              <w:right w:w="100" w:type="dxa"/>
-            </w:tcMar>
-          </w:tcPr>
-          <w:p>
-            <w:pPr>
-              <w:rPr>
-                <w:rFonts w:ascii="Open Sans" w:eastAsia="Open Sans" w:hAnsi="Open Sans" w:cs="Open Sans"/>
-                <w:b/>
-                <w:sz w:val="24"/>
-                <w:szCs w:val="24"/>
-              </w:rPr>
-            </w:pPr>
-            <w:r>
-              <w:rPr>
-                <w:rFonts w:ascii="Open Sans" w:eastAsia="Open Sans" w:hAnsi="Open Sans" w:cs="Open Sans"/>
-                <w:b/>
-                <w:sz w:val="24"/>
-                <w:szCs w:val="24"/>
-              </w:rPr>
-              <w:t>Is access to the materials…</w:t>
-            </w:r>
-          </w:p>
-          <w:p>
-            <w:pPr>
-              <w:numPr>
-                <w:ilvl w:val="0"/>
-                <w:numId w:val="2"/>
-              </w:numPr>
-              <w:rPr>
-                <w:rFonts w:ascii="Open Sans" w:eastAsia="Open Sans" w:hAnsi="Open Sans" w:cs="Open Sans"/>
-                <w:b/>
-                <w:sz w:val="24"/>
-                <w:szCs w:val="24"/>
-              </w:rPr>
-            </w:pPr>
-            <w:r>
-              <w:rPr>
-                <w:rFonts w:ascii="Open Sans" w:eastAsia="Open Sans" w:hAnsi="Open Sans" w:cs="Open Sans"/>
-                <w:b/>
-                <w:sz w:val="24"/>
-                <w:szCs w:val="24"/>
-              </w:rPr>
-              <w:t>public</w:t>
-            </w:r>
-          </w:p>
-          <w:p>
-            <w:pPr>
-              <w:numPr>
-                <w:ilvl w:val="0"/>
-                <w:numId w:val="2"/>
-              </w:numPr>
-              <w:rPr>
-                <w:rFonts w:ascii="Open Sans" w:eastAsia="Open Sans" w:hAnsi="Open Sans" w:cs="Open Sans"/>
-                <w:b/>
-                <w:sz w:val="24"/>
-                <w:szCs w:val="24"/>
-              </w:rPr>
-            </w:pPr>
-            <w:r>
-              <w:rPr>
-                <w:rFonts w:ascii="Open Sans" w:eastAsia="Open Sans" w:hAnsi="Open Sans" w:cs="Open Sans"/>
-                <w:b/>
-                <w:sz w:val="24"/>
-                <w:szCs w:val="24"/>
-              </w:rPr>
-              <w:t>restricted</w:t>
-            </w:r>
-          </w:p>
-          <w:p>
-            <w:pPr>
-              <w:numPr>
-                <w:ilvl w:val="0"/>
-                <w:numId w:val="2"/>
-              </w:numPr>
-              <w:rPr>
-                <w:rFonts w:ascii="Open Sans" w:eastAsia="Open Sans" w:hAnsi="Open Sans" w:cs="Open Sans"/>
-                <w:b/>
-                <w:sz w:val="24"/>
-                <w:szCs w:val="24"/>
-              </w:rPr>
-            </w:pPr>
-            <w:r>
-              <w:rPr>
-                <w:rFonts w:ascii="Open Sans" w:eastAsia="Open Sans" w:hAnsi="Open Sans" w:cs="Open Sans"/>
-                <w:b/>
-                <w:sz w:val="24"/>
-                <w:szCs w:val="24"/>
-              </w:rPr>
-              <w:lastRenderedPageBreak/>
-              <w:t>materials are not available</w:t>
-            </w:r>
-          </w:p>
-          <w:p>
-            <w:pPr>
-              <w:numPr>
-                <w:ilvl w:val="0"/>
-                <w:numId w:val="2"/>
-              </w:numPr>
-              <w:rPr>
-                <w:rFonts w:ascii="Open Sans" w:eastAsia="Open Sans" w:hAnsi="Open Sans" w:cs="Open Sans"/>
-                <w:b/>
-                <w:sz w:val="24"/>
-                <w:szCs w:val="24"/>
-              </w:rPr>
-            </w:pPr>
-            <w:r>
-              <w:rPr>
-                <w:rFonts w:ascii="Open Sans" w:eastAsia="Open Sans" w:hAnsi="Open Sans" w:cs="Open Sans"/>
-                <w:b/>
-                <w:sz w:val="24"/>
-                <w:szCs w:val="24"/>
-              </w:rPr>
-              <w:t>other (please expand)</w:t>
-            </w:r>
-          </w:p>
-        </w:tc>
-        <w:tc>
-          <w:tcPr>
-            <w:tcW w:w="4514" w:type="dxa"/>
-            <w:tcMar>
-              <w:top w:w="100" w:type="dxa"/>
-              <w:left w:w="100" w:type="dxa"/>
-              <w:bottom w:w="100" w:type="dxa"/>
-              <w:right w:w="100" w:type="dxa"/>
-            </w:tcMar>
-          </w:tcPr>
-          <w:p>
-            <w:pPr>
-              <w:widowControl w:val="0"/>
-              <w:spacing w:line="240" w:lineRule="auto"/>
-            </w:pPr>
-            <w:r>
-              <w:lastRenderedPageBreak/>
-              <w:t>N/A</w:t>
-            </w:r>
-          </w:p>
-        </w:tc>
-      </w:tr>
-      <w:tr>
-        <w:tc>
-          <w:tcPr>
-            <w:tcW w:w="4514" w:type="dxa"/>
-            <w:tcMar>
-              <w:top w:w="100" w:type="dxa"/>
-              <w:left w:w="100" w:type="dxa"/>
-              <w:bottom w:w="100" w:type="dxa"/>
-              <w:right w:w="100" w:type="dxa"/>
-            </w:tcMar>
-          </w:tcPr>
-          <w:p>
-            <w:pPr>
-              <w:rPr>
-                <w:b/>
-              </w:rPr>
-            </w:pPr>
-            <w:r>
-              <w:rPr>
-                <w:rFonts w:ascii="Open Sans" w:eastAsia="Open Sans" w:hAnsi="Open Sans" w:cs="Open Sans"/>
-                <w:b/>
-                <w:sz w:val="24"/>
-                <w:szCs w:val="24"/>
-              </w:rPr>
-              <w:t xml:space="preserve">If the materials are not publicly available, please explain why not. Please provide documentation where possible (e.g., copies of access </w:t>
-            </w:r>
-            <w:proofErr w:type="gramStart"/>
-            <w:r>
-              <w:rPr>
-                <w:rFonts w:ascii="Open Sans" w:eastAsia="Open Sans" w:hAnsi="Open Sans" w:cs="Open Sans"/>
-                <w:b/>
-                <w:sz w:val="24"/>
-                <w:szCs w:val="24"/>
-              </w:rPr>
-              <w:t>agreements)*</w:t>
-            </w:r>
-            <w:proofErr w:type="gramEnd"/>
-            <w:r>
-              <w:rPr>
-                <w:rFonts w:ascii="Open Sans" w:eastAsia="Open Sans" w:hAnsi="Open Sans" w:cs="Open Sans"/>
-                <w:b/>
-                <w:sz w:val="24"/>
-                <w:szCs w:val="24"/>
-              </w:rPr>
-              <w:t>.</w:t>
-            </w:r>
-          </w:p>
-        </w:tc>
-        <w:tc>
-          <w:tcPr>
-            <w:tcW w:w="4514" w:type="dxa"/>
-            <w:tcMar>
-              <w:top w:w="100" w:type="dxa"/>
-              <w:left w:w="100" w:type="dxa"/>
-              <w:bottom w:w="100" w:type="dxa"/>
-              <w:right w:w="100" w:type="dxa"/>
-            </w:tcMar>
-          </w:tcPr>
-          <w:p>
-            <w:pPr>
-              <w:widowControl w:val="0"/>
-              <w:spacing w:line="240" w:lineRule="auto"/>
-            </w:pPr>
-            <w:r>
-              <w:t>N/A</w:t>
-            </w:r>
-          </w:p>
-        </w:tc>
-      </w:tr>
-      <w:tr>
-        <w:tc>
-          <w:tcPr>
-            <w:tcW w:w="4514" w:type="dxa"/>
-            <w:tcMar>
-              <w:top w:w="100" w:type="dxa"/>
-              <w:left w:w="100" w:type="dxa"/>
-              <w:bottom w:w="100" w:type="dxa"/>
-              <w:right w:w="100" w:type="dxa"/>
-            </w:tcMar>
-          </w:tcPr>
-          <w:p>
-            <w:pPr>
-              <w:rPr>
-                <w:rFonts w:ascii="Open Sans" w:eastAsia="Open Sans" w:hAnsi="Open Sans" w:cs="Open Sans"/>
-                <w:b/>
-                <w:sz w:val="24"/>
-                <w:szCs w:val="24"/>
-              </w:rPr>
-            </w:pPr>
-            <w:r>
-              <w:rPr>
-                <w:rFonts w:ascii="Open Sans" w:eastAsia="Open Sans" w:hAnsi="Open Sans" w:cs="Open Sans"/>
-                <w:b/>
-                <w:sz w:val="24"/>
-                <w:szCs w:val="24"/>
-              </w:rPr>
-              <w:t>Provide clear step-by-step instructions explaining how the materials were obtained / how an independent researcher could access the materials. Ensure that you provide sufficient detail about accessing the *specific materials used in the present study*.</w:t>
-            </w:r>
-          </w:p>
-        </w:tc>
-        <w:tc>
-          <w:tcPr>
-            <w:tcW w:w="4514" w:type="dxa"/>
-            <w:tcMar>
-              <w:top w:w="100" w:type="dxa"/>
-              <w:left w:w="100" w:type="dxa"/>
-              <w:bottom w:w="100" w:type="dxa"/>
-              <w:right w:w="100" w:type="dxa"/>
-            </w:tcMar>
-          </w:tcPr>
-          <w:p>
-            <w:pPr>
-              <w:widowControl w:val="0"/>
-              <w:spacing w:line="240" w:lineRule="auto"/>
-            </w:pPr>
-            <w:r>
-              <w:t>N/A</w:t>
-            </w:r>
-          </w:p>
-        </w:tc>
-      </w:tr>
-      <w:tr>
-        <w:tc>
-          <w:tcPr>
-            <w:tcW w:w="4514" w:type="dxa"/>
-            <w:tcMar>
-              <w:top w:w="100" w:type="dxa"/>
-              <w:left w:w="100" w:type="dxa"/>
-              <w:bottom w:w="100" w:type="dxa"/>
-              <w:right w:w="100" w:type="dxa"/>
-            </w:tcMar>
-          </w:tcPr>
-          <w:p>
-            <w:pPr>
-              <w:rPr>
-                <w:rFonts w:ascii="Open Sans" w:eastAsia="Open Sans" w:hAnsi="Open Sans" w:cs="Open Sans"/>
-                <w:b/>
-                <w:sz w:val="24"/>
-                <w:szCs w:val="24"/>
-              </w:rPr>
-            </w:pPr>
-            <w:r>
-              <w:rPr>
-                <w:rFonts w:ascii="Open Sans" w:eastAsia="Open Sans" w:hAnsi="Open Sans" w:cs="Open Sans"/>
-                <w:b/>
-                <w:sz w:val="24"/>
-                <w:szCs w:val="24"/>
-              </w:rPr>
-              <w:t xml:space="preserve">Are the materials stored in a location that qualifies as a </w:t>
-            </w:r>
-            <w:hyperlink r:id="rId16">
-              <w:r>
-                <w:rPr>
-                  <w:rFonts w:ascii="Open Sans" w:eastAsia="Open Sans" w:hAnsi="Open Sans" w:cs="Open Sans"/>
-                  <w:b/>
-                  <w:color w:val="1155CC"/>
-                  <w:sz w:val="24"/>
-                  <w:szCs w:val="24"/>
-                </w:rPr>
-                <w:t>trusted repository</w:t>
-              </w:r>
-            </w:hyperlink>
-            <w:r>
-              <w:rPr>
-                <w:rFonts w:ascii="Open Sans" w:eastAsia="Open Sans" w:hAnsi="Open Sans" w:cs="Open Sans"/>
-                <w:b/>
-                <w:sz w:val="24"/>
-                <w:szCs w:val="24"/>
-              </w:rPr>
-              <w:t>?</w:t>
-            </w:r>
-          </w:p>
-        </w:tc>
-        <w:tc>
-          <w:tcPr>
-            <w:tcW w:w="4514" w:type="dxa"/>
-            <w:tcMar>
-              <w:top w:w="100" w:type="dxa"/>
-              <w:left w:w="100" w:type="dxa"/>
-              <w:bottom w:w="100" w:type="dxa"/>
-              <w:right w:w="100" w:type="dxa"/>
-            </w:tcMar>
-          </w:tcPr>
-          <w:p>
-            <w:pPr>
-              <w:widowControl w:val="0"/>
-              <w:spacing w:line="240" w:lineRule="auto"/>
-            </w:pPr>
-            <w:r>
-              <w:t>N/A</w:t>
-            </w:r>
-          </w:p>
-        </w:tc>
-      </w:tr>
-      <w:tr>
-        <w:tc>
-          <w:tcPr>
-            <w:tcW w:w="4514" w:type="dxa"/>
-            <w:tcMar>
-              <w:top w:w="100" w:type="dxa"/>
-              <w:left w:w="100" w:type="dxa"/>
-              <w:bottom w:w="100" w:type="dxa"/>
-              <w:right w:w="100" w:type="dxa"/>
-            </w:tcMar>
-          </w:tcPr>
-          <w:p>
-            <w:pPr>
-              <w:rPr>
-                <w:rFonts w:ascii="Open Sans" w:eastAsia="Open Sans" w:hAnsi="Open Sans" w:cs="Open Sans"/>
-                <w:b/>
-                <w:sz w:val="24"/>
-                <w:szCs w:val="24"/>
-              </w:rPr>
-            </w:pPr>
-            <w:r>
-              <w:rPr>
-                <w:rFonts w:ascii="Open Sans" w:eastAsia="Open Sans" w:hAnsi="Open Sans" w:cs="Open Sans"/>
-                <w:b/>
-                <w:sz w:val="24"/>
-                <w:szCs w:val="24"/>
-              </w:rPr>
-              <w:t>Please link to documentation that describes the materials.</w:t>
-            </w:r>
-          </w:p>
-        </w:tc>
-        <w:tc>
-          <w:tcPr>
-            <w:tcW w:w="4514" w:type="dxa"/>
-            <w:tcMar>
-              <w:top w:w="100" w:type="dxa"/>
-              <w:left w:w="100" w:type="dxa"/>
-              <w:bottom w:w="100" w:type="dxa"/>
-              <w:right w:w="100" w:type="dxa"/>
-            </w:tcMar>
-          </w:tcPr>
-          <w:p>
-            <w:pPr>
-              <w:widowControl w:val="0"/>
-              <w:spacing w:line="240" w:lineRule="auto"/>
-            </w:pPr>
-            <w:r>
-              <w:t>N/A</w:t>
-            </w:r>
-          </w:p>
-        </w:tc>
-      </w:tr>
-      <w:tr>
-        <w:tc>
-          <w:tcPr>
-            <w:tcW w:w="4514" w:type="dxa"/>
-            <w:tcMar>
-              <w:top w:w="100" w:type="dxa"/>
-              <w:left w:w="100" w:type="dxa"/>
-              <w:bottom w:w="100" w:type="dxa"/>
-              <w:right w:w="100" w:type="dxa"/>
-            </w:tcMar>
-          </w:tcPr>
-          <w:p>
-            <w:pPr>
-              <w:rPr>
-                <w:rFonts w:ascii="Open Sans" w:eastAsia="Open Sans" w:hAnsi="Open Sans" w:cs="Open Sans"/>
-                <w:b/>
-                <w:sz w:val="24"/>
-                <w:szCs w:val="24"/>
-              </w:rPr>
-            </w:pPr>
-            <w:r>
-              <w:rPr>
-                <w:rFonts w:ascii="Open Sans" w:eastAsia="Open Sans" w:hAnsi="Open Sans" w:cs="Open Sans"/>
-                <w:b/>
-                <w:sz w:val="24"/>
-                <w:szCs w:val="24"/>
-              </w:rPr>
-              <w:t>Other information about these materials.</w:t>
-            </w:r>
-          </w:p>
-        </w:tc>
-        <w:tc>
-          <w:tcPr>
-            <w:tcW w:w="4514" w:type="dxa"/>
-            <w:tcMar>
-              <w:top w:w="100" w:type="dxa"/>
-              <w:left w:w="100" w:type="dxa"/>
-              <w:bottom w:w="100" w:type="dxa"/>
-              <w:right w:w="100" w:type="dxa"/>
-            </w:tcMar>
-          </w:tcPr>
-          <w:p>
-            <w:pPr>
-              <w:widowControl w:val="0"/>
               <w:spacing w:line="240" w:lineRule="auto"/>
             </w:pPr>
             <w:r>
@@ -5075,6 +4221,7 @@
   <w:style w:type="character" w:default="1" w:styleId="DefaultParagraphFont">
     <w:name w:val="Default Paragraph Font"/>
     <w:uiPriority w:val="1"/>
+    <w:semiHidden/>
     <w:unhideWhenUsed/>
   </w:style>
   <w:style w:type="table" w:default="1" w:styleId="TableNormal">

</xml_diff>